<commit_message>
chore: Update Project Documents
</commit_message>
<xml_diff>
--- a/docs/Report_1_VS.docx
+++ b/docs/Report_1_VS.docx
@@ -63,15 +63,15 @@
         <mc:AlternateContent>
           <mc:Choice Requires="wpg">
             <w:drawing>
-              <wp:anchor distT="0" distB="0" distL="114300" distR="114300" simplePos="0" relativeHeight="251658240" behindDoc="0" locked="0" layoutInCell="1" hidden="0" allowOverlap="1" wp14:anchorId="61AFC0C0" wp14:editId="2E82782B">
+              <wp:anchor distT="0" distB="0" distL="114300" distR="114300" simplePos="0" relativeHeight="251658240" behindDoc="0" locked="0" layoutInCell="1" hidden="0" allowOverlap="1" wp14:anchorId="36F84962" wp14:editId="6E240299">
                 <wp:simplePos x="0" y="0"/>
                 <wp:positionH relativeFrom="column">
-                  <wp:posOffset>-33275</wp:posOffset>
+                  <wp:posOffset>-42799</wp:posOffset>
                 </wp:positionH>
                 <wp:positionV relativeFrom="paragraph">
-                  <wp:posOffset>37629</wp:posOffset>
+                  <wp:posOffset>28104</wp:posOffset>
                 </wp:positionV>
-                <wp:extent cx="5992339" cy="38100"/>
+                <wp:extent cx="6011389" cy="57150"/>
                 <wp:effectExtent l="0" t="0" r="0" b="0"/>
                 <wp:wrapNone/>
                 <wp:docPr id="1" name="Straight Arrow Connector 1"/>
@@ -94,7 +94,7 @@
                             <a:schemeClr val="accent1"/>
                           </a:solidFill>
                           <a:prstDash val="solid"/>
-                          <a:miter lim="80"/>
+                          <a:miter lim="0"/>
                           <a:headEnd type="none" w="sm" len="sm"/>
                           <a:tailEnd type="none" w="sm" len="sm"/>
                         </a:ln>
@@ -106,17 +106,17 @@
               </wp:anchor>
             </w:drawing>
           </mc:Choice>
-          <mc:Fallback xmlns:sl="http://schemas.openxmlformats.org/schemaLibrary/2006/main" xmlns:a="http://schemas.openxmlformats.org/drawingml/2006/main" xmlns:pic="http://schemas.openxmlformats.org/drawingml/2006/picture" xmlns:c="http://schemas.openxmlformats.org/drawingml/2006/chart" xmlns:lc="http://schemas.openxmlformats.org/drawingml/2006/lockedCanvas" xmlns:dgm="http://schemas.openxmlformats.org/drawingml/2006/diagram" xmlns="http://schemas.microsoft.com/office/tasks/2019/documenttasks" xmlns:cr="http://schemas.microsoft.com/office/comments/2020/reactions">
+          <mc:Fallback xmlns:cr="http://schemas.microsoft.com/office/comments/2020/reactions" xmlns="http://schemas.microsoft.com/office/tasks/2019/documenttasks" xmlns:dgm="http://schemas.openxmlformats.org/drawingml/2006/diagram" xmlns:lc="http://schemas.openxmlformats.org/drawingml/2006/lockedCanvas" xmlns:c="http://schemas.openxmlformats.org/drawingml/2006/chart" xmlns:pic="http://schemas.openxmlformats.org/drawingml/2006/picture" xmlns:a="http://schemas.openxmlformats.org/drawingml/2006/main" xmlns:sl="http://schemas.openxmlformats.org/schemaLibrary/2006/main">
             <w:drawing>
               <wp:anchor allowOverlap="1" behindDoc="0" distB="0" distT="0" distL="114300" distR="114300" hidden="0" layoutInCell="1" locked="0" relativeHeight="0" simplePos="0">
                 <wp:simplePos x="0" y="0"/>
                 <wp:positionH relativeFrom="column">
-                  <wp:posOffset>-33275</wp:posOffset>
+                  <wp:posOffset>-42799</wp:posOffset>
                 </wp:positionH>
                 <wp:positionV relativeFrom="paragraph">
-                  <wp:posOffset>37629</wp:posOffset>
+                  <wp:posOffset>28104</wp:posOffset>
                 </wp:positionV>
-                <wp:extent cx="5992339" cy="38100"/>
+                <wp:extent cx="6011389" cy="57150"/>
                 <wp:effectExtent b="0" l="0" r="0" t="0"/>
                 <wp:wrapNone/>
                 <wp:docPr id="1" name="image1.png"/>
@@ -137,7 +137,7 @@
                       <pic:spPr>
                         <a:xfrm>
                           <a:off x="0" y="0"/>
-                          <a:ext cx="5992339" cy="38100"/>
+                          <a:ext cx="6011389" cy="57150"/>
                         </a:xfrm>
                         <a:prstGeom prst="rect"/>
                         <a:ln/>
@@ -229,7 +229,7 @@
                 <w:sz w:val="18"/>
                 <w:szCs w:val="18"/>
               </w:rPr>
-              <w:t>v1.3</w:t>
+              <w:t>v1.4</w:t>
             </w:r>
           </w:p>
         </w:tc>
@@ -290,7 +290,7 @@
                 <w:sz w:val="18"/>
                 <w:szCs w:val="18"/>
               </w:rPr>
-              <w:t>18/06/2026</w:t>
+              <w:t>01/07/2026</w:t>
             </w:r>
           </w:p>
         </w:tc>
@@ -305,7 +305,7 @@
       <w:pPr>
         <w:pStyle w:val="Heading1"/>
       </w:pPr>
-      <w:bookmarkStart w:id="1" w:name="_Toc232953237"/>
+      <w:bookmarkStart w:id="1" w:name="_Toc234912083"/>
       <w:r>
         <w:t>Change Log</w:t>
       </w:r>
@@ -981,6 +981,148 @@
           </w:p>
         </w:tc>
       </w:tr>
+      <w:tr>
+        <w:tc>
+          <w:tcPr>
+            <w:tcW w:w="1140" w:type="dxa"/>
+            <w:tcBorders>
+              <w:top w:val="single" w:sz="4" w:space="0" w:color="CCCCCC"/>
+              <w:left w:val="single" w:sz="4" w:space="0" w:color="CCCCCC"/>
+              <w:bottom w:val="single" w:sz="4" w:space="0" w:color="CCCCCC"/>
+              <w:right w:val="single" w:sz="4" w:space="0" w:color="CCCCCC"/>
+            </w:tcBorders>
+            <w:shd w:val="clear" w:color="auto" w:fill="FFFFFF"/>
+            <w:tcMar>
+              <w:top w:w="80" w:type="dxa"/>
+              <w:left w:w="120" w:type="dxa"/>
+              <w:bottom w:w="80" w:type="dxa"/>
+              <w:right w:w="120" w:type="dxa"/>
+            </w:tcMar>
+          </w:tcPr>
+          <w:p>
+            <w:pPr>
+              <w:rPr>
+                <w:color w:val="1A1A1A"/>
+                <w:sz w:val="20"/>
+                <w:szCs w:val="20"/>
+              </w:rPr>
+            </w:pPr>
+            <w:r>
+              <w:rPr>
+                <w:color w:val="1A1A1A"/>
+                <w:sz w:val="20"/>
+                <w:szCs w:val="20"/>
+              </w:rPr>
+              <w:t>v1.4</w:t>
+            </w:r>
+          </w:p>
+        </w:tc>
+        <w:tc>
+          <w:tcPr>
+            <w:tcW w:w="1845" w:type="dxa"/>
+            <w:tcBorders>
+              <w:top w:val="single" w:sz="4" w:space="0" w:color="CCCCCC"/>
+              <w:left w:val="single" w:sz="4" w:space="0" w:color="CCCCCC"/>
+              <w:bottom w:val="single" w:sz="4" w:space="0" w:color="CCCCCC"/>
+              <w:right w:val="single" w:sz="4" w:space="0" w:color="CCCCCC"/>
+            </w:tcBorders>
+            <w:shd w:val="clear" w:color="auto" w:fill="FFFFFF"/>
+            <w:tcMar>
+              <w:top w:w="80" w:type="dxa"/>
+              <w:left w:w="120" w:type="dxa"/>
+              <w:bottom w:w="80" w:type="dxa"/>
+              <w:right w:w="120" w:type="dxa"/>
+            </w:tcMar>
+          </w:tcPr>
+          <w:p>
+            <w:pPr>
+              <w:rPr>
+                <w:color w:val="1A1A1A"/>
+                <w:sz w:val="20"/>
+                <w:szCs w:val="20"/>
+              </w:rPr>
+            </w:pPr>
+            <w:r>
+              <w:rPr>
+                <w:color w:val="1A1A1A"/>
+                <w:sz w:val="20"/>
+                <w:szCs w:val="20"/>
+              </w:rPr>
+              <w:t>01/07/2026</w:t>
+            </w:r>
+          </w:p>
+        </w:tc>
+        <w:tc>
+          <w:tcPr>
+            <w:tcW w:w="2175" w:type="dxa"/>
+            <w:tcBorders>
+              <w:top w:val="single" w:sz="4" w:space="0" w:color="CCCCCC"/>
+              <w:left w:val="single" w:sz="4" w:space="0" w:color="CCCCCC"/>
+              <w:bottom w:val="single" w:sz="4" w:space="0" w:color="CCCCCC"/>
+              <w:right w:val="single" w:sz="4" w:space="0" w:color="CCCCCC"/>
+            </w:tcBorders>
+            <w:shd w:val="clear" w:color="auto" w:fill="FFFFFF"/>
+            <w:tcMar>
+              <w:top w:w="80" w:type="dxa"/>
+              <w:left w:w="120" w:type="dxa"/>
+              <w:bottom w:w="80" w:type="dxa"/>
+              <w:right w:w="120" w:type="dxa"/>
+            </w:tcMar>
+          </w:tcPr>
+          <w:p>
+            <w:pPr>
+              <w:rPr>
+                <w:color w:val="1A1A1A"/>
+                <w:sz w:val="20"/>
+                <w:szCs w:val="20"/>
+              </w:rPr>
+            </w:pPr>
+            <w:r>
+              <w:rPr>
+                <w:color w:val="1A1A1A"/>
+                <w:sz w:val="20"/>
+                <w:szCs w:val="20"/>
+              </w:rPr>
+              <w:t>Hoang Khoi Nguyen</w:t>
+            </w:r>
+          </w:p>
+        </w:tc>
+        <w:tc>
+          <w:tcPr>
+            <w:tcW w:w="4215" w:type="dxa"/>
+            <w:tcBorders>
+              <w:top w:val="single" w:sz="4" w:space="0" w:color="CCCCCC"/>
+              <w:left w:val="single" w:sz="4" w:space="0" w:color="CCCCCC"/>
+              <w:bottom w:val="single" w:sz="4" w:space="0" w:color="CCCCCC"/>
+              <w:right w:val="single" w:sz="4" w:space="0" w:color="CCCCCC"/>
+            </w:tcBorders>
+            <w:shd w:val="clear" w:color="auto" w:fill="FFFFFF"/>
+            <w:tcMar>
+              <w:top w:w="80" w:type="dxa"/>
+              <w:left w:w="120" w:type="dxa"/>
+              <w:bottom w:w="80" w:type="dxa"/>
+              <w:right w:w="120" w:type="dxa"/>
+            </w:tcMar>
+          </w:tcPr>
+          <w:p>
+            <w:pPr>
+              <w:rPr>
+                <w:color w:val="1A1A1A"/>
+                <w:sz w:val="20"/>
+                <w:szCs w:val="20"/>
+              </w:rPr>
+            </w:pPr>
+            <w:r>
+              <w:rPr>
+                <w:color w:val="1A1A1A"/>
+                <w:sz w:val="20"/>
+                <w:szCs w:val="20"/>
+              </w:rPr>
+              <w:t xml:space="preserve">Replaced all Facebook scraping features with a clean Organic Marketplace &amp; B2B SaaS CRM </w:t>
+            </w:r>
+          </w:p>
+        </w:tc>
+      </w:tr>
     </w:tbl>
     <w:p>
       <w:r>
@@ -991,7 +1133,7 @@
       <w:pPr>
         <w:pStyle w:val="Heading1"/>
       </w:pPr>
-      <w:bookmarkStart w:id="2" w:name="_Toc232953238"/>
+      <w:bookmarkStart w:id="2" w:name="_Toc234912084"/>
       <w:r>
         <w:lastRenderedPageBreak/>
         <w:t>Table of Contents</w:t>
@@ -1000,13 +1142,12 @@
     </w:p>
     <w:sdt>
       <w:sdtPr>
-        <w:id w:val="1986381945"/>
+        <w:id w:val="-1497440128"/>
         <w:docPartObj>
           <w:docPartGallery w:val="Table of Contents"/>
           <w:docPartUnique/>
         </w:docPartObj>
       </w:sdtPr>
-      <w:sdtEndPr/>
       <w:sdtContent>
         <w:p>
           <w:pPr>
@@ -1027,7 +1168,7 @@
           <w:r>
             <w:fldChar w:fldCharType="separate"/>
           </w:r>
-          <w:hyperlink w:anchor="_Toc232953237" w:history="1">
+          <w:hyperlink w:anchor="_Toc234912083" w:history="1">
             <w:r>
               <w:rPr>
                 <w:rStyle w:val="Hyperlink"/>
@@ -1054,7 +1195,7 @@
                 <w:noProof/>
                 <w:webHidden/>
               </w:rPr>
-              <w:instrText xml:space="preserve"> PAGEREF _Toc232953237 \h </w:instrText>
+              <w:instrText xml:space="preserve"> PAGEREF _Toc234912083 \h </w:instrText>
             </w:r>
             <w:r>
               <w:rPr>
@@ -1095,7 +1236,7 @@
               <w:noProof/>
             </w:rPr>
           </w:pPr>
-          <w:hyperlink w:anchor="_Toc232953238" w:history="1">
+          <w:hyperlink w:anchor="_Toc234912084" w:history="1">
             <w:r>
               <w:rPr>
                 <w:rStyle w:val="Hyperlink"/>
@@ -1122,7 +1263,7 @@
                 <w:noProof/>
                 <w:webHidden/>
               </w:rPr>
-              <w:instrText xml:space="preserve"> PAGEREF _Toc232953238 \h </w:instrText>
+              <w:instrText xml:space="preserve"> PAGEREF _Toc234912084 \h </w:instrText>
             </w:r>
             <w:r>
               <w:rPr>
@@ -1163,7 +1304,7 @@
               <w:noProof/>
             </w:rPr>
           </w:pPr>
-          <w:hyperlink w:anchor="_Toc232953239" w:history="1">
+          <w:hyperlink w:anchor="_Toc234912085" w:history="1">
             <w:r>
               <w:rPr>
                 <w:rStyle w:val="Hyperlink"/>
@@ -1190,7 +1331,7 @@
                 <w:noProof/>
                 <w:webHidden/>
               </w:rPr>
-              <w:instrText xml:space="preserve"> PAGEREF _Toc232953239 \h </w:instrText>
+              <w:instrText xml:space="preserve"> PAGEREF _Toc234912085 \h </w:instrText>
             </w:r>
             <w:r>
               <w:rPr>
@@ -1231,7 +1372,7 @@
               <w:noProof/>
             </w:rPr>
           </w:pPr>
-          <w:hyperlink w:anchor="_Toc232953240" w:history="1">
+          <w:hyperlink w:anchor="_Toc234912086" w:history="1">
             <w:r>
               <w:rPr>
                 <w:rStyle w:val="Hyperlink"/>
@@ -1258,7 +1399,7 @@
                 <w:noProof/>
                 <w:webHidden/>
               </w:rPr>
-              <w:instrText xml:space="preserve"> PAGEREF _Toc232953240 \h </w:instrText>
+              <w:instrText xml:space="preserve"> PAGEREF _Toc234912086 \h </w:instrText>
             </w:r>
             <w:r>
               <w:rPr>
@@ -1299,7 +1440,7 @@
               <w:noProof/>
             </w:rPr>
           </w:pPr>
-          <w:hyperlink w:anchor="_Toc232953241" w:history="1">
+          <w:hyperlink w:anchor="_Toc234912087" w:history="1">
             <w:r>
               <w:rPr>
                 <w:rStyle w:val="Hyperlink"/>
@@ -1326,7 +1467,7 @@
                 <w:noProof/>
                 <w:webHidden/>
               </w:rPr>
-              <w:instrText xml:space="preserve"> PAGEREF _Toc232953241 \h </w:instrText>
+              <w:instrText xml:space="preserve"> PAGEREF _Toc234912087 \h </w:instrText>
             </w:r>
             <w:r>
               <w:rPr>
@@ -1367,13 +1508,13 @@
               <w:noProof/>
             </w:rPr>
           </w:pPr>
-          <w:hyperlink w:anchor="_Toc232953242" w:history="1">
+          <w:hyperlink w:anchor="_Toc234912088" w:history="1">
             <w:r>
               <w:rPr>
                 <w:rStyle w:val="Hyperlink"/>
                 <w:noProof/>
               </w:rPr>
-              <w:t>2.2  Gia sư Bảo Châu</w:t>
+              <w:t>2.2  Gia su Bao Chau</w:t>
             </w:r>
             <w:r>
               <w:rPr>
@@ -1394,7 +1535,7 @@
                 <w:noProof/>
                 <w:webHidden/>
               </w:rPr>
-              <w:instrText xml:space="preserve"> PAGEREF _Toc232953242 \h </w:instrText>
+              <w:instrText xml:space="preserve"> PAGEREF _Toc234912088 \h </w:instrText>
             </w:r>
             <w:r>
               <w:rPr>
@@ -1435,7 +1576,7 @@
               <w:noProof/>
             </w:rPr>
           </w:pPr>
-          <w:hyperlink w:anchor="_Toc232953243" w:history="1">
+          <w:hyperlink w:anchor="_Toc234912089" w:history="1">
             <w:r>
               <w:rPr>
                 <w:rStyle w:val="Hyperlink"/>
@@ -1462,7 +1603,7 @@
                 <w:noProof/>
                 <w:webHidden/>
               </w:rPr>
-              <w:instrText xml:space="preserve"> PAGEREF _Toc232953243 \h </w:instrText>
+              <w:instrText xml:space="preserve"> PAGEREF _Toc234912089 \h </w:instrText>
             </w:r>
             <w:r>
               <w:rPr>
@@ -1503,7 +1644,7 @@
               <w:noProof/>
             </w:rPr>
           </w:pPr>
-          <w:hyperlink w:anchor="_Toc232953244" w:history="1">
+          <w:hyperlink w:anchor="_Toc234912090" w:history="1">
             <w:r>
               <w:rPr>
                 <w:rStyle w:val="Hyperlink"/>
@@ -1530,7 +1671,7 @@
                 <w:noProof/>
                 <w:webHidden/>
               </w:rPr>
-              <w:instrText xml:space="preserve"> PAGEREF _Toc232953244 \h </w:instrText>
+              <w:instrText xml:space="preserve"> PAGEREF _Toc234912090 \h </w:instrText>
             </w:r>
             <w:r>
               <w:rPr>
@@ -1571,7 +1712,7 @@
               <w:noProof/>
             </w:rPr>
           </w:pPr>
-          <w:hyperlink w:anchor="_Toc232953245" w:history="1">
+          <w:hyperlink w:anchor="_Toc234912091" w:history="1">
             <w:r>
               <w:rPr>
                 <w:rStyle w:val="Hyperlink"/>
@@ -1598,7 +1739,7 @@
                 <w:noProof/>
                 <w:webHidden/>
               </w:rPr>
-              <w:instrText xml:space="preserve"> PAGEREF _Toc232953245 \h </w:instrText>
+              <w:instrText xml:space="preserve"> PAGEREF _Toc234912091 \h </w:instrText>
             </w:r>
             <w:r>
               <w:rPr>
@@ -1639,7 +1780,7 @@
               <w:noProof/>
             </w:rPr>
           </w:pPr>
-          <w:hyperlink w:anchor="_Toc232953246" w:history="1">
+          <w:hyperlink w:anchor="_Toc234912092" w:history="1">
             <w:r>
               <w:rPr>
                 <w:rStyle w:val="Hyperlink"/>
@@ -1666,7 +1807,7 @@
                 <w:noProof/>
                 <w:webHidden/>
               </w:rPr>
-              <w:instrText xml:space="preserve"> PAGEREF _Toc232953246 \h </w:instrText>
+              <w:instrText xml:space="preserve"> PAGEREF _Toc234912092 \h </w:instrText>
             </w:r>
             <w:r>
               <w:rPr>
@@ -1707,7 +1848,7 @@
               <w:noProof/>
             </w:rPr>
           </w:pPr>
-          <w:hyperlink w:anchor="_Toc232953247" w:history="1">
+          <w:hyperlink w:anchor="_Toc234912093" w:history="1">
             <w:r>
               <w:rPr>
                 <w:rStyle w:val="Hyperlink"/>
@@ -1734,7 +1875,7 @@
                 <w:noProof/>
                 <w:webHidden/>
               </w:rPr>
-              <w:instrText xml:space="preserve"> PAGEREF _Toc232953247 \h </w:instrText>
+              <w:instrText xml:space="preserve"> PAGEREF _Toc234912093 \h </w:instrText>
             </w:r>
             <w:r>
               <w:rPr>
@@ -1775,7 +1916,7 @@
               <w:noProof/>
             </w:rPr>
           </w:pPr>
-          <w:hyperlink w:anchor="_Toc232953248" w:history="1">
+          <w:hyperlink w:anchor="_Toc234912094" w:history="1">
             <w:r>
               <w:rPr>
                 <w:rStyle w:val="Hyperlink"/>
@@ -1802,7 +1943,7 @@
                 <w:noProof/>
                 <w:webHidden/>
               </w:rPr>
-              <w:instrText xml:space="preserve"> PAGEREF _Toc232953248 \h </w:instrText>
+              <w:instrText xml:space="preserve"> PAGEREF _Toc234912094 \h </w:instrText>
             </w:r>
             <w:r>
               <w:rPr>
@@ -1822,7 +1963,7 @@
                 <w:noProof/>
                 <w:webHidden/>
               </w:rPr>
-              <w:t>13</w:t>
+              <w:t>12</w:t>
             </w:r>
             <w:r>
               <w:rPr>
@@ -1843,7 +1984,7 @@
               <w:noProof/>
             </w:rPr>
           </w:pPr>
-          <w:hyperlink w:anchor="_Toc232953249" w:history="1">
+          <w:hyperlink w:anchor="_Toc234912095" w:history="1">
             <w:r>
               <w:rPr>
                 <w:rStyle w:val="Hyperlink"/>
@@ -1870,7 +2011,7 @@
                 <w:noProof/>
                 <w:webHidden/>
               </w:rPr>
-              <w:instrText xml:space="preserve"> PAGEREF _Toc232953249 \h </w:instrText>
+              <w:instrText xml:space="preserve"> PAGEREF _Toc234912095 \h </w:instrText>
             </w:r>
             <w:r>
               <w:rPr>
@@ -1890,7 +2031,7 @@
                 <w:noProof/>
                 <w:webHidden/>
               </w:rPr>
-              <w:t>15</w:t>
+              <w:t>14</w:t>
             </w:r>
             <w:r>
               <w:rPr>
@@ -1911,7 +2052,7 @@
               <w:noProof/>
             </w:rPr>
           </w:pPr>
-          <w:hyperlink w:anchor="_Toc232953250" w:history="1">
+          <w:hyperlink w:anchor="_Toc234912096" w:history="1">
             <w:r>
               <w:rPr>
                 <w:rStyle w:val="Hyperlink"/>
@@ -1938,7 +2079,7 @@
                 <w:noProof/>
                 <w:webHidden/>
               </w:rPr>
-              <w:instrText xml:space="preserve"> PAGEREF _Toc232953250 \h </w:instrText>
+              <w:instrText xml:space="preserve"> PAGEREF _Toc234912096 \h </w:instrText>
             </w:r>
             <w:r>
               <w:rPr>
@@ -1958,7 +2099,7 @@
                 <w:noProof/>
                 <w:webHidden/>
               </w:rPr>
-              <w:t>15</w:t>
+              <w:t>14</w:t>
             </w:r>
             <w:r>
               <w:rPr>
@@ -1979,7 +2120,7 @@
               <w:noProof/>
             </w:rPr>
           </w:pPr>
-          <w:hyperlink w:anchor="_Toc232953251" w:history="1">
+          <w:hyperlink w:anchor="_Toc234912097" w:history="1">
             <w:r>
               <w:rPr>
                 <w:rStyle w:val="Hyperlink"/>
@@ -2006,7 +2147,7 @@
                 <w:noProof/>
                 <w:webHidden/>
               </w:rPr>
-              <w:instrText xml:space="preserve"> PAGEREF _Toc232953251 \h </w:instrText>
+              <w:instrText xml:space="preserve"> PAGEREF _Toc234912097 \h </w:instrText>
             </w:r>
             <w:r>
               <w:rPr>
@@ -2026,7 +2167,7 @@
                 <w:noProof/>
                 <w:webHidden/>
               </w:rPr>
-              <w:t>16</w:t>
+              <w:t>15</w:t>
             </w:r>
             <w:r>
               <w:rPr>
@@ -2047,7 +2188,7 @@
               <w:noProof/>
             </w:rPr>
           </w:pPr>
-          <w:hyperlink w:anchor="_Toc232953252" w:history="1">
+          <w:hyperlink w:anchor="_Toc234912098" w:history="1">
             <w:r>
               <w:rPr>
                 <w:rStyle w:val="Hyperlink"/>
@@ -2074,7 +2215,7 @@
                 <w:noProof/>
                 <w:webHidden/>
               </w:rPr>
-              <w:instrText xml:space="preserve"> PAGEREF _Toc232953252 \h </w:instrText>
+              <w:instrText xml:space="preserve"> PAGEREF _Toc234912098 \h </w:instrText>
             </w:r>
             <w:r>
               <w:rPr>
@@ -2094,7 +2235,7 @@
                 <w:noProof/>
                 <w:webHidden/>
               </w:rPr>
-              <w:t>17</w:t>
+              <w:t>16</w:t>
             </w:r>
             <w:r>
               <w:rPr>
@@ -2109,7 +2250,7 @@
           <w:pPr>
             <w:widowControl w:val="0"/>
             <w:tabs>
-              <w:tab w:val="right" w:leader="dot" w:pos="12000"/>
+              <w:tab w:val="right" w:pos="12000"/>
             </w:tabs>
             <w:spacing w:before="60"/>
             <w:ind w:left="360"/>
@@ -2135,7 +2276,7 @@
           <w:bottom w:val="single" w:sz="12" w:space="4" w:color="1A4A5C"/>
         </w:pBdr>
       </w:pPr>
-      <w:bookmarkStart w:id="3" w:name="_Toc232953239"/>
+      <w:bookmarkStart w:id="3" w:name="_Toc234912085"/>
       <w:r>
         <w:lastRenderedPageBreak/>
         <w:t>1. Product Background</w:t>
@@ -2335,9 +2476,8 @@
             <w:sdt>
               <w:sdtPr>
                 <w:tag w:val="goog_rdk_0"/>
-                <w:id w:val="484343614"/>
+                <w:id w:val="1623018622"/>
               </w:sdtPr>
-              <w:sdtEndPr/>
               <w:sdtContent>
                 <w:r>
                   <w:rPr>
@@ -2504,7 +2644,7 @@
           <w:bottom w:val="single" w:sz="12" w:space="4" w:color="1A4A5C"/>
         </w:pBdr>
       </w:pPr>
-      <w:bookmarkStart w:id="4" w:name="_Toc232953240"/>
+      <w:bookmarkStart w:id="4" w:name="_Toc234912086"/>
       <w:r>
         <w:lastRenderedPageBreak/>
         <w:t>2. Existing Solutions</w:t>
@@ -2609,9 +2749,8 @@
             <w:sdt>
               <w:sdtPr>
                 <w:tag w:val="goog_rdk_1"/>
-                <w:id w:val="2084157894"/>
+                <w:id w:val="-271021511"/>
               </w:sdtPr>
-              <w:sdtEndPr/>
               <w:sdtContent>
                 <w:r>
                   <w:rPr>
@@ -2641,7 +2780,7 @@
       <w:pPr>
         <w:pStyle w:val="Heading2"/>
       </w:pPr>
-      <w:bookmarkStart w:id="5" w:name="_Toc232953241"/>
+      <w:bookmarkStart w:id="5" w:name="_Toc234912087"/>
       <w:r>
         <w:rPr>
           <w:color w:val="1A1A1A"/>
@@ -2694,9 +2833,8 @@
             <w:sdt>
               <w:sdtPr>
                 <w:tag w:val="goog_rdk_2"/>
-                <w:id w:val="-1484593767"/>
+                <w:id w:val="1284168746"/>
               </w:sdtPr>
-              <w:sdtEndPr/>
               <w:sdtContent>
                 <w:r>
                   <w:rPr>
@@ -3749,12 +3887,12 @@
       <w:pPr>
         <w:pStyle w:val="Heading2"/>
       </w:pPr>
-      <w:bookmarkStart w:id="6" w:name="_Toc232953242"/>
+      <w:bookmarkStart w:id="6" w:name="_Toc234912088"/>
       <w:r>
         <w:rPr>
           <w:color w:val="1A1A1A"/>
         </w:rPr>
-        <w:t>2.2  Gia sư Bảo Châu</w:t>
+        <w:t>2.2  Gia su Bao Chau</w:t>
       </w:r>
       <w:bookmarkEnd w:id="6"/>
     </w:p>
@@ -3764,7 +3902,7 @@
         <w:jc w:val="both"/>
       </w:pPr>
       <w:r>
-        <w:t>Gia Sư Bảo Châu is a Vietnamese tutoring center that provides tutor matching services between students and tutors through a centralized management model.</w:t>
+        <w:t>Gia Su Bao Chau is a Vietnamese tutoring center that provides tutor matching services between students and tutors through a centralized management model.</w:t>
       </w:r>
     </w:p>
     <w:p>
@@ -4768,7 +4906,7 @@
       <w:pPr>
         <w:pStyle w:val="Heading2"/>
       </w:pPr>
-      <w:bookmarkStart w:id="7" w:name="_Toc232953243"/>
+      <w:bookmarkStart w:id="7" w:name="_Toc234912089"/>
       <w:r>
         <w:rPr>
           <w:color w:val="1A1A1A"/>
@@ -5274,7 +5412,7 @@
       <w:pPr>
         <w:pStyle w:val="Heading2"/>
       </w:pPr>
-      <w:bookmarkStart w:id="8" w:name="_Toc232953244"/>
+      <w:bookmarkStart w:id="8" w:name="_Toc234912090"/>
       <w:r>
         <w:rPr>
           <w:color w:val="1A1A1A"/>
@@ -5898,9 +6036,8 @@
             <w:sdt>
               <w:sdtPr>
                 <w:tag w:val="goog_rdk_3"/>
-                <w:id w:val="-125073411"/>
+                <w:id w:val="-438130458"/>
               </w:sdtPr>
-              <w:sdtEndPr/>
               <w:sdtContent>
                 <w:r>
                   <w:rPr>
@@ -6010,6 +6147,12 @@
         <w:t xml:space="preserve">Although existing solutions provide partial support for tutor discovery, recruitment, or online teaching, each platform addresses only a specific portion of the tutoring ecosystem. Facebook groups offer accessibility but lack trust and structure, tutor centers rely heavily on manual processes, while platforms such as ClassIn and TutorOcean focus primarily on teaching delivery or one-to-one tutor matching rather than comprehensive recruitment and management workflows. </w:t>
       </w:r>
     </w:p>
+    <w:p>
+      <w:pPr>
+        <w:spacing w:before="200"/>
+        <w:jc w:val="both"/>
+      </w:pPr>
+    </w:p>
     <w:tbl>
       <w:tblPr>
         <w:tblStyle w:val="af1"/>
@@ -6497,98 +6640,6 @@
           </w:p>
         </w:tc>
       </w:tr>
-      <w:tr>
-        <w:tc>
-          <w:tcPr>
-            <w:tcW w:w="1185" w:type="dxa"/>
-            <w:tcBorders>
-              <w:top w:val="single" w:sz="4" w:space="0" w:color="CCCCCC"/>
-              <w:left w:val="single" w:sz="4" w:space="0" w:color="CCCCCC"/>
-              <w:bottom w:val="single" w:sz="4" w:space="0" w:color="CCCCCC"/>
-              <w:right w:val="single" w:sz="4" w:space="0" w:color="CCCCCC"/>
-            </w:tcBorders>
-            <w:shd w:val="clear" w:color="auto" w:fill="FFFFFF"/>
-            <w:tcMar>
-              <w:top w:w="80" w:type="dxa"/>
-              <w:left w:w="120" w:type="dxa"/>
-              <w:bottom w:w="80" w:type="dxa"/>
-              <w:right w:w="120" w:type="dxa"/>
-            </w:tcMar>
-            <w:vAlign w:val="center"/>
-          </w:tcPr>
-          <w:p>
-            <w:r>
-              <w:rPr>
-                <w:color w:val="333333"/>
-                <w:sz w:val="20"/>
-                <w:szCs w:val="20"/>
-              </w:rPr>
-              <w:t>GAP-05</w:t>
-            </w:r>
-          </w:p>
-        </w:tc>
-        <w:tc>
-          <w:tcPr>
-            <w:tcW w:w="2865" w:type="dxa"/>
-            <w:tcBorders>
-              <w:top w:val="single" w:sz="4" w:space="0" w:color="B8860B"/>
-              <w:left w:val="single" w:sz="4" w:space="0" w:color="B8860B"/>
-              <w:bottom w:val="single" w:sz="4" w:space="0" w:color="B8860B"/>
-              <w:right w:val="single" w:sz="4" w:space="0" w:color="B8860B"/>
-            </w:tcBorders>
-            <w:shd w:val="clear" w:color="auto" w:fill="FDF6E3"/>
-            <w:tcMar>
-              <w:top w:w="80" w:type="dxa"/>
-              <w:left w:w="120" w:type="dxa"/>
-              <w:bottom w:w="80" w:type="dxa"/>
-              <w:right w:w="120" w:type="dxa"/>
-            </w:tcMar>
-          </w:tcPr>
-          <w:p>
-            <w:pPr>
-              <w:spacing w:before="120" w:line="288" w:lineRule="auto"/>
-            </w:pPr>
-            <w:r>
-              <w:rPr>
-                <w:sz w:val="20"/>
-                <w:szCs w:val="20"/>
-              </w:rPr>
-              <w:t xml:space="preserve">Data Fragmentation and Lead Chaos on Social Networks </w:t>
-            </w:r>
-          </w:p>
-        </w:tc>
-        <w:tc>
-          <w:tcPr>
-            <w:tcW w:w="5175" w:type="dxa"/>
-            <w:tcBorders>
-              <w:top w:val="single" w:sz="4" w:space="0" w:color="B8860B"/>
-              <w:left w:val="single" w:sz="4" w:space="0" w:color="B8860B"/>
-              <w:bottom w:val="single" w:sz="4" w:space="0" w:color="B8860B"/>
-              <w:right w:val="single" w:sz="4" w:space="0" w:color="B8860B"/>
-            </w:tcBorders>
-            <w:shd w:val="clear" w:color="auto" w:fill="FDF6E3"/>
-            <w:tcMar>
-              <w:top w:w="80" w:type="dxa"/>
-              <w:left w:w="120" w:type="dxa"/>
-              <w:bottom w:w="80" w:type="dxa"/>
-              <w:right w:w="120" w:type="dxa"/>
-            </w:tcMar>
-          </w:tcPr>
-          <w:p>
-            <w:pPr>
-              <w:spacing w:before="120" w:line="288" w:lineRule="auto"/>
-              <w:jc w:val="both"/>
-            </w:pPr>
-            <w:r>
-              <w:rPr>
-                <w:sz w:val="20"/>
-                <w:szCs w:val="20"/>
-              </w:rPr>
-              <w:t xml:space="preserve">Current market solutions keep specialized web platforms completely isolated from social media channels (Facebook Groups). There is an absence of automated tools to scrape, clean, deduplicate, and route public social data into structured CRM pipelines for educational centers, leading to high administrative overhead and operational inefficiency.  </w:t>
-            </w:r>
-          </w:p>
-        </w:tc>
-      </w:tr>
     </w:tbl>
     <w:p>
       <w:pPr>
@@ -6596,9 +6647,14 @@
         <w:jc w:val="both"/>
       </w:pPr>
       <w:r>
-        <w:lastRenderedPageBreak/>
         <w:t xml:space="preserve">As a result, none of these solutions fully integrates tutor verification, recruitment management, communication, scheduling, reputation tracking, and transaction support for all key stakeholders within a single platform. This gap creates the need for the Tutor Connect System (TCS), which aims to provide a centralized, transparent, and scalable ecosystem that connects Clients, Tutors, Tutor Centers, and Platform Administrators through a unified workflow. </w:t>
       </w:r>
+    </w:p>
+    <w:p>
+      <w:pPr>
+        <w:spacing w:before="200"/>
+        <w:jc w:val="both"/>
+      </w:pPr>
     </w:p>
     <w:p>
       <w:pPr>
@@ -6607,8 +6663,9 @@
           <w:bottom w:val="single" w:sz="12" w:space="4" w:color="1A4A5C"/>
         </w:pBdr>
       </w:pPr>
-      <w:bookmarkStart w:id="9" w:name="_Toc232953245"/>
+      <w:bookmarkStart w:id="9" w:name="_Toc234912091"/>
       <w:r>
+        <w:lastRenderedPageBreak/>
         <w:t>3. Proposed Solution</w:t>
       </w:r>
       <w:bookmarkEnd w:id="9"/>
@@ -6800,9 +6857,8 @@
             <w:sdt>
               <w:sdtPr>
                 <w:tag w:val="goog_rdk_4"/>
-                <w:id w:val="-572862855"/>
+                <w:id w:val="509319170"/>
               </w:sdtPr>
-              <w:sdtEndPr/>
               <w:sdtContent>
                 <w:r>
                   <w:rPr>
@@ -6836,39 +6892,45 @@
     </w:p>
     <w:p>
       <w:pPr>
-        <w:spacing w:after="240" w:line="276" w:lineRule="auto"/>
+        <w:spacing w:before="240" w:after="240" w:line="276" w:lineRule="auto"/>
         <w:jc w:val="both"/>
       </w:pPr>
       <w:r>
-        <w:t>The Tutor Connect System (TCS) overcomes the limitations of existing solutions by providing a centralized platform that integrates tutor recruitment, verified tutor profiles, application management, scheduling, communication, evaluation, and payment support for clients, tutors, tutor centers, and platform administrators. This system improves transparency, minimizes manual processes, and enables efficient tutor search and recruitment.</w:t>
+        <w:t>The Tutor Connect System (TCS) overcomes the limitations of existing solutions by providing a centralized platform that integrates tutor recruitment, verified tutor profiles, application management, scheduling, internal communication, evaluation, and secure escrow payment support for clients, tutors, tutor centers, and platform administrators. This system improves transparency, minimizes manual processes, and enables efficient tutor search, allocation, and corporate recruitment.</w:t>
       </w:r>
     </w:p>
     <w:p>
       <w:pPr>
-        <w:spacing w:after="240" w:line="276" w:lineRule="auto"/>
+        <w:spacing w:before="240" w:after="240" w:line="276" w:lineRule="auto"/>
         <w:jc w:val="both"/>
       </w:pPr>
       <w:r>
-        <w:t>TCS operates as a Hybrid platform that acts not only as a tutoring marketplace but also as a Lead Generation &amp; CRM tool for tutor centers. By capturing and filtering unverified leads from fragmented social media environments and feeding them into a structured digital workflow, the system significantly reduces manual coordination efforts for the tutor centers.</w:t>
+        <w:t>TCS operates as a Hybrid SaaS Platform that acts concurrently as an open tutoring marketplace and a robust internal Customer Relationship Management (CRM) &amp; Operations tool for tutor centers. By providing private administrative spaces, structured digital workflows, and tools like bulk Excel data exchange and internal tutor assignments, the system significantly reduces operational overhead and manual coordination efforts for partner organizations.</w:t>
       </w:r>
     </w:p>
     <w:p>
       <w:pPr>
-        <w:spacing w:after="240" w:line="276" w:lineRule="auto"/>
+        <w:spacing w:before="240" w:after="240" w:line="276" w:lineRule="auto"/>
         <w:jc w:val="both"/>
       </w:pPr>
       <w:r>
-        <w:t>For students and parents, the Tutor Connect System offers the benefit of quickly finding verified and qualified tutors. With tutors gaining more teaching opportunities and increased professional visibility, tutor centers  can streamline recruitment, leverage automated external lead pipelines, and optimize internal operational processes. Concurrently, platform administrators can efficiently manage platform activities, user verification, and service quality through a centralized system. As a result, this system improves trust, efficiency, and overall service quality throughout the entire tutoring ecosystem.</w:t>
+        <w:t>For students and parents (Clients), the Tutor Connect System offers the benefit of quickly finding verified and qualified tutors with zero platform circumvention. With tutors gaining more teaching opportunities and increased professional visibility, tutor centers can streamline their independent recruitment campaigns, nurture internal tutor pools, and optimize lesson scheduling workflows. Concurrently, platform administrators can efficiently monitor platform activities, oversee e-contract verification, and maintain overall service quality through a centralized dashboard. As a result, this system improves trust, data integrity, and overall service quality throughout the entire tutoring ecosystem.</w:t>
       </w:r>
     </w:p>
     <w:p>
       <w:pPr>
-        <w:spacing w:after="240" w:line="276" w:lineRule="auto"/>
+        <w:spacing w:before="240" w:after="240" w:line="276" w:lineRule="auto"/>
         <w:jc w:val="both"/>
       </w:pPr>
       <w:r>
-        <w:t>This is the right time for Tutor Connect System because the tutoring market is rapidly growing and current solutions do not provide a complete, integrated platform. By bridging the gap between isolated web networks and unmanaged social media spaces, and by centralizing lead ingestion, tutor recruitment, verification, scheduling, communication, and management, the system offers a more efficient, transparent, and scalable solution for all stakeholders.</w:t>
+        <w:t>This is the right time for Tutor Connect System because the tutoring market is rapidly growing and current solutions do not provide a complete, integrated platform. By bridging the gap between independent market participants and institutional providers, and by centralizing internal recruitment pipelines, multi-party e-contracting, scheduling, secure escrow wallet, and peer evaluation, the system offers a more efficient, transparent, and scalable solution for all stakeholders.</w:t>
       </w:r>
+    </w:p>
+    <w:p>
+      <w:pPr>
+        <w:spacing w:before="240" w:after="240" w:line="276" w:lineRule="auto"/>
+        <w:jc w:val="both"/>
+      </w:pPr>
     </w:p>
     <w:p>
       <w:pPr>
@@ -6877,7 +6939,7 @@
           <w:bottom w:val="single" w:sz="12" w:space="4" w:color="1A4A5C"/>
         </w:pBdr>
       </w:pPr>
-      <w:bookmarkStart w:id="10" w:name="_Toc232953246"/>
+      <w:bookmarkStart w:id="10" w:name="_Toc234912092"/>
       <w:r>
         <w:lastRenderedPageBreak/>
         <w:t>4. Project Scope &amp; Limitations</w:t>
@@ -6886,7 +6948,7 @@
     </w:p>
     <w:tbl>
       <w:tblPr>
-        <w:tblStyle w:val="af5"/>
+        <w:tblStyle w:val="af4"/>
         <w:tblW w:w="9360" w:type="dxa"/>
         <w:tblInd w:w="0" w:type="dxa"/>
         <w:tblBorders>
@@ -6995,7 +7057,7 @@
       <w:pPr>
         <w:pStyle w:val="Heading2"/>
       </w:pPr>
-      <w:bookmarkStart w:id="11" w:name="_Toc232953247"/>
+      <w:bookmarkStart w:id="11" w:name="_Toc234912093"/>
       <w:r>
         <w:rPr>
           <w:color w:val="1A1A1A"/>
@@ -7026,7 +7088,7 @@
     </w:p>
     <w:tbl>
       <w:tblPr>
-        <w:tblStyle w:val="af6"/>
+        <w:tblStyle w:val="af5"/>
         <w:tblW w:w="9360" w:type="dxa"/>
         <w:tblInd w:w="0" w:type="dxa"/>
         <w:tblBorders>
@@ -7170,7 +7232,7 @@
                 <w:sz w:val="20"/>
                 <w:szCs w:val="20"/>
               </w:rPr>
-              <w:t>Addresses Gap</w:t>
+              <w:t>Addresses GAP</w:t>
             </w:r>
           </w:p>
         </w:tc>
@@ -7231,7 +7293,7 @@
                 <w:sz w:val="20"/>
                 <w:szCs w:val="20"/>
               </w:rPr>
-              <w:t>User Authentication &amp; Role-Based Access Control (RBAC)</w:t>
+              <w:t xml:space="preserve">Authentication &amp; RBAC </w:t>
             </w:r>
           </w:p>
         </w:tc>
@@ -7262,7 +7324,7 @@
                 <w:sz w:val="20"/>
                 <w:szCs w:val="20"/>
               </w:rPr>
-              <w:t>Provides secure registration, login, password recovery and role-based authorization for four primary user groups: Tutors, Clients (Parents/Students), Tutor Centers, and Platform Administrators.</w:t>
+              <w:t xml:space="preserve">Provides secure access to the platform and ensures every user only sees and does what their role permits. It manages the full account lifecycle and lets parents govern their children's learning under a single linked account. </w:t>
             </w:r>
           </w:p>
         </w:tc>
@@ -7353,7 +7415,7 @@
                 <w:sz w:val="20"/>
                 <w:szCs w:val="20"/>
               </w:rPr>
-              <w:t>Profile Management &amp; Verification Workflow</w:t>
+              <w:t xml:space="preserve">Profile &amp; Identity Verification Workflow </w:t>
             </w:r>
           </w:p>
         </w:tc>
@@ -7384,7 +7446,7 @@
                 <w:sz w:val="20"/>
                 <w:szCs w:val="20"/>
               </w:rPr>
-              <w:t>Handles comprehensive profile data for all roles. Incorporates a rigorous background verification workflow where tutors upload digital credentials (IDs, degrees, certificates, transcripts) and tutor centers upload business licenses for admin review.</w:t>
+              <w:t>Establishes trust before any engagement by confirming that tutors and centers are who they claim to be and are genuinely qualified. It turns raw documents and credentials into a verified, reliable profile and keeps each tutor's real availability up to date.</w:t>
             </w:r>
           </w:p>
         </w:tc>
@@ -7475,7 +7537,7 @@
                 <w:sz w:val="20"/>
                 <w:szCs w:val="20"/>
               </w:rPr>
-              <w:t xml:space="preserve">Unified Tutoring Request &amp; Class Life-cycle Management </w:t>
+              <w:t>Class Life-cycle Management</w:t>
             </w:r>
           </w:p>
         </w:tc>
@@ -7506,7 +7568,7 @@
                 <w:sz w:val="20"/>
                 <w:szCs w:val="20"/>
               </w:rPr>
-              <w:t xml:space="preserve">Act as the centralized convergence engine for all active tutoring openings on the platform. It accommodates two distinct data ingestion paths: organic class creation by direct Web Clients, and formal lead-to-class conversion by verified tutor centers after successful offline verification of social leads. The feature manages the entire class status life-cycle. </w:t>
+              <w:t xml:space="preserve">Runs a class from creation to completion in one controlled flow – matching a tutor to it, scheduling lessons, tracking progress, and handling mid-course changes such as replacements or early termination – so every party always knows the current, agreed status. </w:t>
             </w:r>
           </w:p>
         </w:tc>
@@ -7536,7 +7598,7 @@
                 <w:sz w:val="20"/>
                 <w:szCs w:val="20"/>
               </w:rPr>
-              <w:t>GAP-04</w:t>
+              <w:t>GAP-01</w:t>
             </w:r>
           </w:p>
         </w:tc>
@@ -7591,13 +7653,17 @@
           <w:p>
             <w:pPr>
               <w:spacing w:before="120" w:line="288" w:lineRule="auto"/>
-            </w:pPr>
-            <w:r>
-              <w:rPr>
-                <w:sz w:val="20"/>
-                <w:szCs w:val="20"/>
-              </w:rPr>
-              <w:t>Advanced Search &amp; Filtering System</w:t>
+              <w:rPr>
+                <w:sz w:val="20"/>
+                <w:szCs w:val="20"/>
+              </w:rPr>
+            </w:pPr>
+            <w:r>
+              <w:rPr>
+                <w:sz w:val="20"/>
+                <w:szCs w:val="20"/>
+              </w:rPr>
+              <w:t>Advanced Search Engine</w:t>
             </w:r>
           </w:p>
         </w:tc>
@@ -7622,13 +7688,17 @@
             <w:pPr>
               <w:spacing w:before="120" w:line="288" w:lineRule="auto"/>
               <w:jc w:val="both"/>
-            </w:pPr>
-            <w:r>
-              <w:rPr>
-                <w:sz w:val="20"/>
-                <w:szCs w:val="20"/>
-              </w:rPr>
-              <w:t>Provides advanced search and filtering capabilities based on multiple criteria, such as subject, location, schedule, tuition fee, user rating, gender, and teaching experience.</w:t>
+              <w:rPr>
+                <w:sz w:val="20"/>
+                <w:szCs w:val="20"/>
+              </w:rPr>
+            </w:pPr>
+            <w:r>
+              <w:rPr>
+                <w:sz w:val="20"/>
+                <w:szCs w:val="20"/>
+              </w:rPr>
+              <w:t xml:space="preserve">Lets users pinpoint the right tutor or class quickly by narrowing results down to what actually matters (budget, location, subject, and specific skills) instead of scrolling through irrelevant listings. </w:t>
             </w:r>
           </w:p>
         </w:tc>
@@ -7713,13 +7783,17 @@
           <w:p>
             <w:pPr>
               <w:spacing w:before="120" w:line="288" w:lineRule="auto"/>
-            </w:pPr>
-            <w:r>
-              <w:rPr>
-                <w:sz w:val="20"/>
-                <w:szCs w:val="20"/>
-              </w:rPr>
-              <w:t>Internal Messaging &amp; Real-Time Notification</w:t>
+              <w:rPr>
+                <w:sz w:val="20"/>
+                <w:szCs w:val="20"/>
+              </w:rPr>
+            </w:pPr>
+            <w:r>
+              <w:rPr>
+                <w:sz w:val="20"/>
+                <w:szCs w:val="20"/>
+              </w:rPr>
+              <w:t>Intelligent Dynamic Matchmaking</w:t>
             </w:r>
           </w:p>
         </w:tc>
@@ -7744,14 +7818,28 @@
             <w:pPr>
               <w:spacing w:before="120" w:line="288" w:lineRule="auto"/>
               <w:jc w:val="both"/>
-            </w:pPr>
-            <w:r>
-              <w:rPr>
-                <w:sz w:val="20"/>
-                <w:szCs w:val="20"/>
-              </w:rPr>
-              <w:t>Integrates a secure internal real-time messaging channel (powered by WebSocket) enabling instant communication between Tutors, Clients, and Tutor Centers. Dispatches automated instant alerts for critical system events, profile status changes, applications, schedules, or transaction-related updates.</w:t>
-            </w:r>
+              <w:rPr>
+                <w:sz w:val="20"/>
+                <w:szCs w:val="20"/>
+              </w:rPr>
+            </w:pPr>
+            <w:r>
+              <w:rPr>
+                <w:sz w:val="20"/>
+                <w:szCs w:val="20"/>
+              </w:rPr>
+              <w:t>Proactively surfaces the most relevant tutors, classes, and jobs to each user based on their behavior and preferences, so good matches find each other without either side having to search.</w:t>
+            </w:r>
+          </w:p>
+          <w:p>
+            <w:pPr>
+              <w:spacing w:before="120" w:line="288" w:lineRule="auto"/>
+              <w:jc w:val="both"/>
+              <w:rPr>
+                <w:sz w:val="20"/>
+                <w:szCs w:val="20"/>
+              </w:rPr>
+            </w:pPr>
           </w:p>
         </w:tc>
         <w:tc>
@@ -7780,7 +7868,7 @@
                 <w:sz w:val="20"/>
                 <w:szCs w:val="20"/>
               </w:rPr>
-              <w:t>GAP-03</w:t>
+              <w:t>GAP-03, GAP-04</w:t>
             </w:r>
           </w:p>
         </w:tc>
@@ -7836,13 +7924,17 @@
           <w:p>
             <w:pPr>
               <w:spacing w:before="120" w:line="288" w:lineRule="auto"/>
-            </w:pPr>
-            <w:r>
-              <w:rPr>
-                <w:sz w:val="20"/>
-                <w:szCs w:val="20"/>
-              </w:rPr>
-              <w:t xml:space="preserve">Smart Escrow Wallet &amp; E-Contract Management </w:t>
+              <w:rPr>
+                <w:sz w:val="20"/>
+                <w:szCs w:val="20"/>
+              </w:rPr>
+            </w:pPr>
+            <w:r>
+              <w:rPr>
+                <w:sz w:val="20"/>
+                <w:szCs w:val="20"/>
+              </w:rPr>
+              <w:t>Real-time Messaging &amp; Notification</w:t>
             </w:r>
           </w:p>
         </w:tc>
@@ -7867,13 +7959,17 @@
             <w:pPr>
               <w:spacing w:before="120" w:line="288" w:lineRule="auto"/>
               <w:jc w:val="both"/>
-            </w:pPr>
-            <w:r>
-              <w:rPr>
-                <w:sz w:val="20"/>
-                <w:szCs w:val="20"/>
-              </w:rPr>
-              <w:t xml:space="preserve">The platform provides a technology-driven arbitration mechanism that automatically generates electronic contracts upon match establishment. It incorporates an internal virtual wallet system integrated with a Sandbox payment gateway (SePay) via real-time Webhooks to handle escrow hold, dual-confirmation release, and automated refund rules based on contract terms, protecting users from deposit fraud. </w:t>
+              <w:rPr>
+                <w:sz w:val="20"/>
+                <w:szCs w:val="20"/>
+              </w:rPr>
+            </w:pPr>
+            <w:r>
+              <w:rPr>
+                <w:sz w:val="20"/>
+                <w:szCs w:val="20"/>
+              </w:rPr>
+              <w:t xml:space="preserve">Keeps every conversation and update inside the platform, letting parties coordinate instantly and stay informed of anything that needs their attention in real time. </w:t>
             </w:r>
           </w:p>
         </w:tc>
@@ -7958,13 +8054,17 @@
           <w:p>
             <w:pPr>
               <w:spacing w:before="120" w:line="288" w:lineRule="auto"/>
-            </w:pPr>
-            <w:r>
-              <w:rPr>
-                <w:sz w:val="20"/>
-                <w:szCs w:val="20"/>
-              </w:rPr>
-              <w:t>Review &amp; Reputation Management</w:t>
+              <w:rPr>
+                <w:sz w:val="20"/>
+                <w:szCs w:val="20"/>
+              </w:rPr>
+            </w:pPr>
+            <w:r>
+              <w:rPr>
+                <w:sz w:val="20"/>
+                <w:szCs w:val="20"/>
+              </w:rPr>
+              <w:t>Smart Escrow Wallet</w:t>
             </w:r>
           </w:p>
         </w:tc>
@@ -7989,13 +8089,17 @@
             <w:pPr>
               <w:spacing w:before="120" w:line="288" w:lineRule="auto"/>
               <w:jc w:val="both"/>
-            </w:pPr>
-            <w:r>
-              <w:rPr>
-                <w:sz w:val="20"/>
-                <w:szCs w:val="20"/>
-              </w:rPr>
-              <w:t>Allows users to submit ratings and written reviews after tutoring sessions or collaboration periods. The system automatically updates reputation scores to enhance transparency and trust within the user community.</w:t>
+              <w:rPr>
+                <w:sz w:val="20"/>
+                <w:szCs w:val="20"/>
+              </w:rPr>
+            </w:pPr>
+            <w:r>
+              <w:rPr>
+                <w:sz w:val="20"/>
+                <w:szCs w:val="20"/>
+              </w:rPr>
+              <w:t>Protects both sides of a transaction by holding payment safely until obligations are met, then releasing or refunding it automatically. It backs every deal with a binding e-contract and gives users clear visibility into their money and earnings.</w:t>
             </w:r>
           </w:p>
         </w:tc>
@@ -8025,7 +8129,7 @@
                 <w:sz w:val="20"/>
                 <w:szCs w:val="20"/>
               </w:rPr>
-              <w:t>GAP-02</w:t>
+              <w:t>GAP-01</w:t>
             </w:r>
           </w:p>
         </w:tc>
@@ -8080,13 +8184,17 @@
           <w:p>
             <w:pPr>
               <w:spacing w:before="120" w:line="288" w:lineRule="auto"/>
-            </w:pPr>
-            <w:r>
-              <w:rPr>
-                <w:sz w:val="20"/>
-                <w:szCs w:val="20"/>
-              </w:rPr>
-              <w:t>Administrative Dashboard &amp; Platform Monitoring</w:t>
+              <w:rPr>
+                <w:sz w:val="20"/>
+                <w:szCs w:val="20"/>
+              </w:rPr>
+            </w:pPr>
+            <w:r>
+              <w:rPr>
+                <w:sz w:val="20"/>
+                <w:szCs w:val="20"/>
+              </w:rPr>
+              <w:t>Dispute &amp; Resolution Management</w:t>
             </w:r>
           </w:p>
         </w:tc>
@@ -8111,13 +8219,17 @@
             <w:pPr>
               <w:spacing w:before="120" w:line="288" w:lineRule="auto"/>
               <w:jc w:val="both"/>
-            </w:pPr>
-            <w:r>
-              <w:rPr>
-                <w:sz w:val="20"/>
-                <w:szCs w:val="20"/>
-              </w:rPr>
-              <w:t>Provides platform administrators with a centralized dashboard to approve verification requests, monitor system activity, manage complaints, review reports, and intervene in disputes related to payment or service quality.</w:t>
+              <w:rPr>
+                <w:sz w:val="20"/>
+                <w:szCs w:val="20"/>
+              </w:rPr>
+            </w:pPr>
+            <w:r>
+              <w:rPr>
+                <w:sz w:val="20"/>
+                <w:szCs w:val="20"/>
+              </w:rPr>
+              <w:t>Gives users a fair, structured channel to raise problems and request refunds when something goes wrong, and drives each case to a resolution instead of leaving conflicts unresolved between parties.</w:t>
             </w:r>
           </w:p>
         </w:tc>
@@ -8202,13 +8314,17 @@
           <w:p>
             <w:pPr>
               <w:spacing w:before="120" w:line="288" w:lineRule="auto"/>
-            </w:pPr>
-            <w:r>
-              <w:rPr>
-                <w:sz w:val="20"/>
-                <w:szCs w:val="20"/>
-              </w:rPr>
-              <w:t xml:space="preserve">Intelligent Dynamic Matchmaking Engine </w:t>
+              <w:rPr>
+                <w:sz w:val="20"/>
+                <w:szCs w:val="20"/>
+              </w:rPr>
+            </w:pPr>
+            <w:r>
+              <w:rPr>
+                <w:sz w:val="20"/>
+                <w:szCs w:val="20"/>
+              </w:rPr>
+              <w:t>Review &amp; Reputation Analytics Engine</w:t>
             </w:r>
           </w:p>
         </w:tc>
@@ -8233,13 +8349,17 @@
             <w:pPr>
               <w:spacing w:before="120" w:line="288" w:lineRule="auto"/>
               <w:jc w:val="both"/>
-            </w:pPr>
-            <w:r>
-              <w:rPr>
-                <w:sz w:val="20"/>
-                <w:szCs w:val="20"/>
-              </w:rPr>
-              <w:t xml:space="preserve">A smart matchmaking engine utilizing weighted feature mapping to connect Clients/Tutor Centers with the most compatible Tutors. The system empowers Clients to dynamically customize the importance (weight) of various input criteria based on their specific expectations, bypassing post-match academic performance monitoring. </w:t>
+              <w:rPr>
+                <w:sz w:val="20"/>
+                <w:szCs w:val="20"/>
+              </w:rPr>
+            </w:pPr>
+            <w:r>
+              <w:rPr>
+                <w:sz w:val="20"/>
+                <w:szCs w:val="20"/>
+              </w:rPr>
+              <w:t>Builds community credibility by capturing genuine feedback after each engagement and turning it into a trust score that helps users judge who to work with.</w:t>
             </w:r>
           </w:p>
         </w:tc>
@@ -8269,7 +8389,7 @@
                 <w:sz w:val="20"/>
                 <w:szCs w:val="20"/>
               </w:rPr>
-              <w:t>GAP-03, GAP-04</w:t>
+              <w:t>GAP-02</w:t>
             </w:r>
           </w:p>
         </w:tc>
@@ -8294,6 +8414,13 @@
             <w:vAlign w:val="center"/>
           </w:tcPr>
           <w:p>
+            <w:pPr>
+              <w:rPr>
+                <w:color w:val="333333"/>
+                <w:sz w:val="20"/>
+                <w:szCs w:val="20"/>
+              </w:rPr>
+            </w:pPr>
             <w:r>
               <w:rPr>
                 <w:color w:val="333333"/>
@@ -8324,13 +8451,17 @@
           <w:p>
             <w:pPr>
               <w:spacing w:before="120" w:line="288" w:lineRule="auto"/>
-            </w:pPr>
-            <w:r>
-              <w:rPr>
-                <w:sz w:val="20"/>
-                <w:szCs w:val="20"/>
-              </w:rPr>
-              <w:t>AI-Powered FAQ Assistant</w:t>
+              <w:rPr>
+                <w:sz w:val="20"/>
+                <w:szCs w:val="20"/>
+              </w:rPr>
+            </w:pPr>
+            <w:r>
+              <w:rPr>
+                <w:sz w:val="20"/>
+                <w:szCs w:val="20"/>
+              </w:rPr>
+              <w:t>Operations Dashboard &amp; Monitoring</w:t>
             </w:r>
           </w:p>
         </w:tc>
@@ -8355,13 +8486,17 @@
             <w:pPr>
               <w:spacing w:before="120" w:line="288" w:lineRule="auto"/>
               <w:jc w:val="both"/>
-            </w:pPr>
-            <w:r>
-              <w:rPr>
-                <w:sz w:val="20"/>
-                <w:szCs w:val="20"/>
-              </w:rPr>
-              <w:t>Integrates a conversational assistant that helps users retrieve frequently asked questions, understand basic procedures, and reduce the workload of human support staff.</w:t>
+              <w:rPr>
+                <w:sz w:val="20"/>
+                <w:szCs w:val="20"/>
+              </w:rPr>
+            </w:pPr>
+            <w:r>
+              <w:rPr>
+                <w:sz w:val="20"/>
+                <w:szCs w:val="20"/>
+              </w:rPr>
+              <w:t>Gives administrators a live, centralized view to keep the platform healthy — spotting off-platform circumvention and abuse, enforcing penalties, and tracing activity through audit logs.</w:t>
             </w:r>
           </w:p>
         </w:tc>
@@ -8385,13 +8520,17 @@
           <w:p>
             <w:pPr>
               <w:spacing w:before="120" w:line="288" w:lineRule="auto"/>
-            </w:pPr>
-            <w:r>
-              <w:rPr>
-                <w:sz w:val="20"/>
-                <w:szCs w:val="20"/>
-              </w:rPr>
-              <w:t>GAP-03</w:t>
+              <w:rPr>
+                <w:sz w:val="20"/>
+                <w:szCs w:val="20"/>
+              </w:rPr>
+            </w:pPr>
+            <w:r>
+              <w:rPr>
+                <w:sz w:val="20"/>
+                <w:szCs w:val="20"/>
+              </w:rPr>
+              <w:t>GAP-01, GAP-02</w:t>
             </w:r>
           </w:p>
         </w:tc>
@@ -8416,6 +8555,13 @@
             <w:vAlign w:val="center"/>
           </w:tcPr>
           <w:p>
+            <w:pPr>
+              <w:rPr>
+                <w:color w:val="333333"/>
+                <w:sz w:val="20"/>
+                <w:szCs w:val="20"/>
+              </w:rPr>
+            </w:pPr>
             <w:r>
               <w:rPr>
                 <w:color w:val="333333"/>
@@ -8446,13 +8592,17 @@
           <w:p>
             <w:pPr>
               <w:spacing w:before="120" w:line="288" w:lineRule="auto"/>
-            </w:pPr>
-            <w:r>
-              <w:rPr>
-                <w:sz w:val="20"/>
-                <w:szCs w:val="20"/>
-              </w:rPr>
-              <w:t>Scheduling &amp; Calendar Management</w:t>
+              <w:rPr>
+                <w:sz w:val="20"/>
+                <w:szCs w:val="20"/>
+              </w:rPr>
+            </w:pPr>
+            <w:r>
+              <w:rPr>
+                <w:sz w:val="20"/>
+                <w:szCs w:val="20"/>
+              </w:rPr>
+              <w:t>Smart Chatbot Advisor</w:t>
             </w:r>
           </w:p>
         </w:tc>
@@ -8477,13 +8627,17 @@
             <w:pPr>
               <w:spacing w:before="120" w:line="288" w:lineRule="auto"/>
               <w:jc w:val="both"/>
-            </w:pPr>
-            <w:r>
-              <w:rPr>
-                <w:sz w:val="20"/>
-                <w:szCs w:val="20"/>
-              </w:rPr>
-              <w:t xml:space="preserve">Provides interactive calendars for Tutors, Clients, and Centers to set availability, schedule lessons, and track slots. It automatically detects time conflicts and sends session reminders. </w:t>
+              <w:rPr>
+                <w:sz w:val="20"/>
+                <w:szCs w:val="20"/>
+              </w:rPr>
+            </w:pPr>
+            <w:r>
+              <w:rPr>
+                <w:sz w:val="20"/>
+                <w:szCs w:val="20"/>
+              </w:rPr>
+              <w:t>Offers instant, on-demand help so users can get answers and guidance without waiting for support, while smoothly onboarding newcomers to the platform.</w:t>
             </w:r>
           </w:p>
         </w:tc>
@@ -8507,13 +8661,17 @@
           <w:p>
             <w:pPr>
               <w:spacing w:before="120" w:line="288" w:lineRule="auto"/>
-            </w:pPr>
-            <w:r>
-              <w:rPr>
-                <w:sz w:val="20"/>
-                <w:szCs w:val="20"/>
-              </w:rPr>
-              <w:t>GAP-04</w:t>
+              <w:rPr>
+                <w:sz w:val="20"/>
+                <w:szCs w:val="20"/>
+              </w:rPr>
+            </w:pPr>
+            <w:r>
+              <w:rPr>
+                <w:sz w:val="20"/>
+                <w:szCs w:val="20"/>
+              </w:rPr>
+              <w:t>GAP-03</w:t>
             </w:r>
           </w:p>
         </w:tc>
@@ -8585,7 +8743,7 @@
                 <w:sz w:val="20"/>
                 <w:szCs w:val="20"/>
               </w:rPr>
-              <w:t xml:space="preserve">Social Data Scraping &amp; NLP Lead Generation Engine </w:t>
+              <w:t>Tutor Recruitment</w:t>
             </w:r>
           </w:p>
         </w:tc>
@@ -8620,7 +8778,7 @@
                 <w:sz w:val="20"/>
                 <w:szCs w:val="20"/>
               </w:rPr>
-              <w:t>Deploys background workers using browser automation to aggregate public posts from tutoring Facebook Groups. It utilizes Natural Language Processing (NLP) to convert unstructured text into standardized "Unverified Lead" JSON profiles, including Subject, Geolocation, Budget, and Client Contact details. These leads are routed to compatible Tutoring Centers for manual validation and final class creation.</w:t>
+              <w:t>Connects centers that need tutors with tutors looking for opportunities through a dedicated hiring channel, streamlining posting, applying, and evaluating candidates.</w:t>
             </w:r>
           </w:p>
         </w:tc>
@@ -8654,290 +8812,7 @@
                 <w:sz w:val="20"/>
                 <w:szCs w:val="20"/>
               </w:rPr>
-              <w:t>GAP-05</w:t>
-            </w:r>
-          </w:p>
-        </w:tc>
-      </w:tr>
-      <w:tr>
-        <w:tc>
-          <w:tcPr>
-            <w:tcW w:w="900" w:type="dxa"/>
-            <w:tcBorders>
-              <w:top w:val="single" w:sz="4" w:space="0" w:color="CCCCCC"/>
-              <w:left w:val="single" w:sz="4" w:space="0" w:color="CCCCCC"/>
-              <w:bottom w:val="single" w:sz="4" w:space="0" w:color="CCCCCC"/>
-              <w:right w:val="single" w:sz="4" w:space="0" w:color="CCCCCC"/>
-            </w:tcBorders>
-            <w:shd w:val="clear" w:color="auto" w:fill="FFFFFF"/>
-            <w:tcMar>
-              <w:top w:w="80" w:type="dxa"/>
-              <w:left w:w="120" w:type="dxa"/>
-              <w:bottom w:w="80" w:type="dxa"/>
-              <w:right w:w="120" w:type="dxa"/>
-            </w:tcMar>
-            <w:vAlign w:val="center"/>
-          </w:tcPr>
-          <w:p>
-            <w:pPr>
-              <w:rPr>
-                <w:color w:val="333333"/>
-                <w:sz w:val="20"/>
-                <w:szCs w:val="20"/>
-              </w:rPr>
-            </w:pPr>
-            <w:r>
-              <w:rPr>
-                <w:color w:val="333333"/>
-                <w:sz w:val="20"/>
-                <w:szCs w:val="20"/>
-              </w:rPr>
-              <w:lastRenderedPageBreak/>
-              <w:t>FE-13</w:t>
-            </w:r>
-          </w:p>
-        </w:tc>
-        <w:tc>
-          <w:tcPr>
-            <w:tcW w:w="2000" w:type="dxa"/>
-            <w:tcBorders>
-              <w:top w:val="single" w:sz="4" w:space="0" w:color="B8860B"/>
-              <w:left w:val="single" w:sz="4" w:space="0" w:color="B8860B"/>
-              <w:bottom w:val="single" w:sz="4" w:space="0" w:color="B8860B"/>
-              <w:right w:val="single" w:sz="4" w:space="0" w:color="B8860B"/>
-            </w:tcBorders>
-            <w:shd w:val="clear" w:color="auto" w:fill="FDF6E3"/>
-            <w:tcMar>
-              <w:top w:w="80" w:type="dxa"/>
-              <w:left w:w="120" w:type="dxa"/>
-              <w:bottom w:w="80" w:type="dxa"/>
-              <w:right w:w="120" w:type="dxa"/>
-            </w:tcMar>
-          </w:tcPr>
-          <w:p>
-            <w:pPr>
-              <w:spacing w:before="120" w:line="288" w:lineRule="auto"/>
-              <w:rPr>
-                <w:sz w:val="20"/>
-                <w:szCs w:val="20"/>
-              </w:rPr>
-            </w:pPr>
-            <w:r>
-              <w:rPr>
-                <w:sz w:val="20"/>
-                <w:szCs w:val="20"/>
-              </w:rPr>
-              <w:t xml:space="preserve">Smart Lead Deduplication Module </w:t>
-            </w:r>
-          </w:p>
-        </w:tc>
-        <w:tc>
-          <w:tcPr>
-            <w:tcW w:w="4900" w:type="dxa"/>
-            <w:tcBorders>
-              <w:top w:val="single" w:sz="4" w:space="0" w:color="B8860B"/>
-              <w:left w:val="single" w:sz="4" w:space="0" w:color="B8860B"/>
-              <w:bottom w:val="single" w:sz="4" w:space="0" w:color="B8860B"/>
-              <w:right w:val="single" w:sz="4" w:space="0" w:color="B8860B"/>
-            </w:tcBorders>
-            <w:shd w:val="clear" w:color="auto" w:fill="FDF6E3"/>
-            <w:tcMar>
-              <w:top w:w="80" w:type="dxa"/>
-              <w:left w:w="120" w:type="dxa"/>
-              <w:bottom w:w="80" w:type="dxa"/>
-              <w:right w:w="120" w:type="dxa"/>
-            </w:tcMar>
-          </w:tcPr>
-          <w:p>
-            <w:pPr>
-              <w:spacing w:before="120" w:line="288" w:lineRule="auto"/>
-              <w:jc w:val="both"/>
-              <w:rPr>
-                <w:sz w:val="20"/>
-                <w:szCs w:val="20"/>
-              </w:rPr>
-            </w:pPr>
-            <w:r>
-              <w:rPr>
-                <w:sz w:val="20"/>
-                <w:szCs w:val="20"/>
-              </w:rPr>
-              <w:t xml:space="preserve">Cleanses and normalizes the incoming unverified lead funnel by applying text-similarity algorithms (e.g., Cosine Similarity/Jaccard Index) across core data vectors (Tuition Fee + Location + Subject). If an incoming lead shares high similarity (&gt;85%) with a pending record, the system auto-merges them into a single unique Lead entity and appends all source Facebook URLs, preventing multiple tutor centers from spamming the same client. </w:t>
-            </w:r>
-          </w:p>
-        </w:tc>
-        <w:tc>
-          <w:tcPr>
-            <w:tcW w:w="1560" w:type="dxa"/>
-            <w:tcBorders>
-              <w:top w:val="single" w:sz="4" w:space="0" w:color="B8860B"/>
-              <w:left w:val="single" w:sz="4" w:space="0" w:color="B8860B"/>
-              <w:bottom w:val="single" w:sz="4" w:space="0" w:color="B8860B"/>
-              <w:right w:val="single" w:sz="4" w:space="0" w:color="B8860B"/>
-            </w:tcBorders>
-            <w:shd w:val="clear" w:color="auto" w:fill="FDF6E3"/>
-            <w:tcMar>
-              <w:top w:w="80" w:type="dxa"/>
-              <w:left w:w="120" w:type="dxa"/>
-              <w:bottom w:w="80" w:type="dxa"/>
-              <w:right w:w="120" w:type="dxa"/>
-            </w:tcMar>
-          </w:tcPr>
-          <w:p>
-            <w:pPr>
-              <w:spacing w:before="120" w:line="288" w:lineRule="auto"/>
-              <w:rPr>
-                <w:sz w:val="20"/>
-                <w:szCs w:val="20"/>
-              </w:rPr>
-            </w:pPr>
-            <w:r>
-              <w:rPr>
-                <w:sz w:val="20"/>
-                <w:szCs w:val="20"/>
-              </w:rPr>
-              <w:t xml:space="preserve">GAP-04, GAP-05 </w:t>
-            </w:r>
-          </w:p>
-        </w:tc>
-      </w:tr>
-      <w:tr>
-        <w:tc>
-          <w:tcPr>
-            <w:tcW w:w="900" w:type="dxa"/>
-            <w:tcBorders>
-              <w:top w:val="single" w:sz="4" w:space="0" w:color="CCCCCC"/>
-              <w:left w:val="single" w:sz="4" w:space="0" w:color="CCCCCC"/>
-              <w:bottom w:val="single" w:sz="4" w:space="0" w:color="CCCCCC"/>
-              <w:right w:val="single" w:sz="4" w:space="0" w:color="CCCCCC"/>
-            </w:tcBorders>
-            <w:shd w:val="clear" w:color="auto" w:fill="F5F5F5"/>
-            <w:tcMar>
-              <w:top w:w="80" w:type="dxa"/>
-              <w:left w:w="120" w:type="dxa"/>
-              <w:bottom w:w="80" w:type="dxa"/>
-              <w:right w:w="120" w:type="dxa"/>
-            </w:tcMar>
-            <w:vAlign w:val="center"/>
-          </w:tcPr>
-          <w:p>
-            <w:pPr>
-              <w:rPr>
-                <w:color w:val="333333"/>
-                <w:sz w:val="20"/>
-                <w:szCs w:val="20"/>
-              </w:rPr>
-            </w:pPr>
-            <w:r>
-              <w:rPr>
-                <w:color w:val="333333"/>
-                <w:sz w:val="20"/>
-                <w:szCs w:val="20"/>
-              </w:rPr>
-              <w:t>FE-14</w:t>
-            </w:r>
-          </w:p>
-        </w:tc>
-        <w:tc>
-          <w:tcPr>
-            <w:tcW w:w="2000" w:type="dxa"/>
-            <w:tcBorders>
-              <w:top w:val="single" w:sz="4" w:space="0" w:color="B8860B"/>
-              <w:left w:val="single" w:sz="4" w:space="0" w:color="B8860B"/>
-              <w:bottom w:val="single" w:sz="4" w:space="0" w:color="B8860B"/>
-              <w:right w:val="single" w:sz="4" w:space="0" w:color="B8860B"/>
-            </w:tcBorders>
-            <w:shd w:val="clear" w:color="auto" w:fill="FDF6E3"/>
-            <w:tcMar>
-              <w:top w:w="80" w:type="dxa"/>
-              <w:left w:w="120" w:type="dxa"/>
-              <w:bottom w:w="80" w:type="dxa"/>
-              <w:right w:w="120" w:type="dxa"/>
-            </w:tcMar>
-          </w:tcPr>
-          <w:p>
-            <w:pPr>
-              <w:spacing w:before="120" w:line="288" w:lineRule="auto"/>
-              <w:rPr>
-                <w:sz w:val="20"/>
-                <w:szCs w:val="20"/>
-              </w:rPr>
-            </w:pPr>
-            <w:r>
-              <w:rPr>
-                <w:sz w:val="20"/>
-                <w:szCs w:val="20"/>
-              </w:rPr>
-              <w:t xml:space="preserve">Unified Lead &amp; Marketing Automation Integration </w:t>
-            </w:r>
-          </w:p>
-        </w:tc>
-        <w:tc>
-          <w:tcPr>
-            <w:tcW w:w="4900" w:type="dxa"/>
-            <w:tcBorders>
-              <w:top w:val="single" w:sz="4" w:space="0" w:color="B8860B"/>
-              <w:left w:val="single" w:sz="4" w:space="0" w:color="B8860B"/>
-              <w:bottom w:val="single" w:sz="4" w:space="0" w:color="B8860B"/>
-              <w:right w:val="single" w:sz="4" w:space="0" w:color="B8860B"/>
-            </w:tcBorders>
-            <w:shd w:val="clear" w:color="auto" w:fill="FDF6E3"/>
-            <w:tcMar>
-              <w:top w:w="80" w:type="dxa"/>
-              <w:left w:w="120" w:type="dxa"/>
-              <w:bottom w:w="80" w:type="dxa"/>
-              <w:right w:w="120" w:type="dxa"/>
-            </w:tcMar>
-          </w:tcPr>
-          <w:p>
-            <w:pPr>
-              <w:spacing w:before="120" w:line="288" w:lineRule="auto"/>
-              <w:jc w:val="both"/>
-              <w:rPr>
-                <w:sz w:val="20"/>
-                <w:szCs w:val="20"/>
-              </w:rPr>
-            </w:pPr>
-            <w:r>
-              <w:rPr>
-                <w:sz w:val="20"/>
-                <w:szCs w:val="20"/>
-              </w:rPr>
-              <w:t xml:space="preserve">Centralizes premium paid marketing channels (Facebook Lead Ads Webhooks and official Page Messenger chatbot funnels) directly into the same internal Lead Management Pipeline utilized by FE-12. It captures leads directly from Facebook interfaces and converts them into structured unverified lead profiles for automated Provider distribution. </w:t>
-            </w:r>
-          </w:p>
-        </w:tc>
-        <w:tc>
-          <w:tcPr>
-            <w:tcW w:w="1560" w:type="dxa"/>
-            <w:tcBorders>
-              <w:top w:val="single" w:sz="4" w:space="0" w:color="B8860B"/>
-              <w:left w:val="single" w:sz="4" w:space="0" w:color="B8860B"/>
-              <w:bottom w:val="single" w:sz="4" w:space="0" w:color="B8860B"/>
-              <w:right w:val="single" w:sz="4" w:space="0" w:color="B8860B"/>
-            </w:tcBorders>
-            <w:shd w:val="clear" w:color="auto" w:fill="FDF6E3"/>
-            <w:tcMar>
-              <w:top w:w="80" w:type="dxa"/>
-              <w:left w:w="120" w:type="dxa"/>
-              <w:bottom w:w="80" w:type="dxa"/>
-              <w:right w:w="120" w:type="dxa"/>
-            </w:tcMar>
-          </w:tcPr>
-          <w:p>
-            <w:pPr>
-              <w:spacing w:before="120" w:line="288" w:lineRule="auto"/>
-              <w:rPr>
-                <w:sz w:val="20"/>
-                <w:szCs w:val="20"/>
-              </w:rPr>
-            </w:pPr>
-            <w:r>
-              <w:rPr>
-                <w:sz w:val="20"/>
-                <w:szCs w:val="20"/>
-              </w:rPr>
-              <w:t>GAP-03, GAP-05</w:t>
+              <w:t>GAP-04</w:t>
             </w:r>
           </w:p>
         </w:tc>
@@ -8950,7 +8825,7 @@
     </w:p>
     <w:tbl>
       <w:tblPr>
-        <w:tblStyle w:val="af7"/>
+        <w:tblStyle w:val="af6"/>
         <w:tblW w:w="9360" w:type="dxa"/>
         <w:tblInd w:w="0" w:type="dxa"/>
         <w:tblBorders>
@@ -9008,7 +8883,7 @@
     </w:p>
     <w:tbl>
       <w:tblPr>
-        <w:tblStyle w:val="af8"/>
+        <w:tblStyle w:val="af7"/>
         <w:tblW w:w="9360" w:type="dxa"/>
         <w:tblInd w:w="0" w:type="dxa"/>
         <w:tblBorders>
@@ -9234,14 +9109,21 @@
             </w:tcMar>
             <w:vAlign w:val="center"/>
           </w:tcPr>
-          <w:p>
-            <w:sdt>
-              <w:sdtPr>
-                <w:tag w:val="goog_rdk_5"/>
-                <w:id w:val="-1348104952"/>
-              </w:sdtPr>
-              <w:sdtEndPr/>
-              <w:sdtContent>
+          <w:sdt>
+            <w:sdtPr>
+              <w:tag w:val="goog_rdk_5"/>
+              <w:id w:val="-1836879721"/>
+            </w:sdtPr>
+            <w:sdtContent>
+              <w:p>
+                <w:pPr>
+                  <w:rPr>
+                    <w:rFonts w:ascii="Arial Unicode MS" w:eastAsia="Arial Unicode MS" w:hAnsi="Arial Unicode MS" w:cs="Arial Unicode MS"/>
+                    <w:color w:val="333333"/>
+                    <w:sz w:val="20"/>
+                    <w:szCs w:val="20"/>
+                  </w:rPr>
+                </w:pPr>
                 <w:r>
                   <w:rPr>
                     <w:rFonts w:ascii="Arial Unicode MS" w:eastAsia="Arial Unicode MS" w:hAnsi="Arial Unicode MS" w:cs="Arial Unicode MS"/>
@@ -9251,9 +9133,20 @@
                   </w:rPr>
                   <w:t>HR Managers create job postings and move candidates through a defined pipeline (Applied → Screening → Interview → Offer → Hired / Rejected) with system-enforced stage transitions.</w:t>
                 </w:r>
-              </w:sdtContent>
-            </w:sdt>
-          </w:p>
+              </w:p>
+              <w:p>
+                <w:pPr>
+                  <w:rPr>
+                    <w:rFonts w:ascii="Arial Unicode MS" w:eastAsia="Arial Unicode MS" w:hAnsi="Arial Unicode MS" w:cs="Arial Unicode MS"/>
+                    <w:color w:val="333333"/>
+                    <w:sz w:val="20"/>
+                    <w:szCs w:val="20"/>
+                  </w:rPr>
+                </w:pPr>
+              </w:p>
+              <w:p/>
+            </w:sdtContent>
+          </w:sdt>
         </w:tc>
         <w:tc>
           <w:tcPr>
@@ -9311,6 +9204,7 @@
                 <w:sz w:val="20"/>
                 <w:szCs w:val="20"/>
               </w:rPr>
+              <w:lastRenderedPageBreak/>
               <w:t>FE-02</w:t>
             </w:r>
           </w:p>
@@ -9767,12 +9661,11 @@
       <w:pPr>
         <w:pStyle w:val="Heading2"/>
       </w:pPr>
-      <w:bookmarkStart w:id="12" w:name="_Toc232953248"/>
+      <w:bookmarkStart w:id="12" w:name="_Toc234912094"/>
       <w:r>
         <w:rPr>
           <w:color w:val="1A1A1A"/>
         </w:rPr>
-        <w:lastRenderedPageBreak/>
         <w:t>4.2  Limitations &amp; Exclusions</w:t>
       </w:r>
       <w:bookmarkEnd w:id="12"/>
@@ -9799,7 +9692,7 @@
     </w:p>
     <w:tbl>
       <w:tblPr>
-        <w:tblStyle w:val="af9"/>
+        <w:tblStyle w:val="af8"/>
         <w:tblW w:w="9360" w:type="dxa"/>
         <w:tblInd w:w="0" w:type="dxa"/>
         <w:tblBorders>
@@ -10156,7 +10049,7 @@
                 <w:sz w:val="20"/>
                 <w:szCs w:val="20"/>
               </w:rPr>
-              <w:t xml:space="preserve">Uncontrolled Social Network Structural Modifications </w:t>
+              <w:t>Third-Party Data Aggregation / Social Scraping</w:t>
             </w:r>
           </w:p>
         </w:tc>
@@ -10187,7 +10080,7 @@
                 <w:sz w:val="20"/>
                 <w:szCs w:val="20"/>
               </w:rPr>
-              <w:t xml:space="preserve">The system automates public text data aggregation via browser automation to generate internal Unverified Leads. However, continuous data ingestion is limited by and dependent on third-party platform layouts; dynamic structural updates or anti-scraping policy shifts by Meta are excluded from automated platform adjustments. </w:t>
+              <w:t>Any automated collection of data from social networks (e.g., Facebook/Meta) is out of scope. The platform relies solely on organic data entered directly by users within the system.</w:t>
             </w:r>
           </w:p>
         </w:tc>
@@ -10273,6 +10166,10 @@
             <w:pPr>
               <w:spacing w:before="120" w:line="288" w:lineRule="auto"/>
               <w:jc w:val="both"/>
+              <w:rPr>
+                <w:sz w:val="20"/>
+                <w:szCs w:val="20"/>
+              </w:rPr>
             </w:pPr>
             <w:r>
               <w:rPr>
@@ -10281,6 +10178,12 @@
               </w:rPr>
               <w:t xml:space="preserve">The platform guarantees the safety of transactions and the transparency of the dynamic matchmaking process. It focuses entirely on input-level compatibility optimization; continuous academic monitoring, remote classroom surveillance, or post-match student grade tracking are explicitly excluded. </w:t>
             </w:r>
+          </w:p>
+          <w:p>
+            <w:pPr>
+              <w:spacing w:before="120" w:line="288" w:lineRule="auto"/>
+              <w:jc w:val="both"/>
+            </w:pPr>
           </w:p>
         </w:tc>
       </w:tr>
@@ -10310,6 +10213,7 @@
                 <w:sz w:val="20"/>
                 <w:szCs w:val="20"/>
               </w:rPr>
+              <w:lastRenderedPageBreak/>
               <w:t>LI-05</w:t>
             </w:r>
           </w:p>
@@ -10559,24 +10463,14 @@
             <w:pPr>
               <w:spacing w:before="120" w:line="288" w:lineRule="auto"/>
               <w:jc w:val="both"/>
-              <w:rPr>
-                <w:sz w:val="20"/>
-                <w:szCs w:val="20"/>
-              </w:rPr>
-            </w:pPr>
-            <w:r>
-              <w:rPr>
-                <w:sz w:val="20"/>
-                <w:szCs w:val="20"/>
-              </w:rPr>
-              <w:t xml:space="preserve">Artificial Intelligence within this release is bound to NLP text parsing for lead profiling, an FAQ chatbot, and the Weighted Feature Mapping algorithm for tutor recommendations. Continuous behavioral tracking or computer-vision-based proctoring during exams are strictly excluded. </w:t>
-            </w:r>
-          </w:p>
-          <w:p>
-            <w:pPr>
-              <w:spacing w:before="120" w:line="288" w:lineRule="auto"/>
-              <w:jc w:val="both"/>
-            </w:pPr>
+            </w:pPr>
+            <w:r>
+              <w:rPr>
+                <w:sz w:val="20"/>
+                <w:szCs w:val="20"/>
+              </w:rPr>
+              <w:t>AI capabilities in this release are limited to an FAQ chatbot and the Weighted Feature Mapping algorithm for tutor recommendations. Continuous behavioral tracking and computer-vision-based proctoring are excluded.</w:t>
+            </w:r>
           </w:p>
         </w:tc>
       </w:tr>
@@ -10606,7 +10500,6 @@
                 <w:sz w:val="20"/>
                 <w:szCs w:val="20"/>
               </w:rPr>
-              <w:lastRenderedPageBreak/>
               <w:t>LI-08</w:t>
             </w:r>
           </w:p>
@@ -10669,98 +10562,6 @@
                 <w:szCs w:val="20"/>
               </w:rPr>
               <w:t>Integrating live production gateways (e.g., live MoMo/VNPay production accounts) requires formal corporate legal entity status. The system instead implements the full Escrow and Virtual Wallet automated engine using dynamic Sandbox payment environments (SePay) integrated via real-time Webhooks for technical verification.</w:t>
-            </w:r>
-          </w:p>
-        </w:tc>
-      </w:tr>
-      <w:tr>
-        <w:tc>
-          <w:tcPr>
-            <w:tcW w:w="900" w:type="dxa"/>
-            <w:tcBorders>
-              <w:top w:val="single" w:sz="4" w:space="0" w:color="CCCCCC"/>
-              <w:left w:val="single" w:sz="4" w:space="0" w:color="CCCCCC"/>
-              <w:bottom w:val="single" w:sz="4" w:space="0" w:color="CCCCCC"/>
-              <w:right w:val="single" w:sz="4" w:space="0" w:color="CCCCCC"/>
-            </w:tcBorders>
-            <w:shd w:val="clear" w:color="auto" w:fill="FFFFFF"/>
-            <w:tcMar>
-              <w:top w:w="80" w:type="dxa"/>
-              <w:left w:w="120" w:type="dxa"/>
-              <w:bottom w:w="80" w:type="dxa"/>
-              <w:right w:w="120" w:type="dxa"/>
-            </w:tcMar>
-            <w:vAlign w:val="center"/>
-          </w:tcPr>
-          <w:p>
-            <w:r>
-              <w:rPr>
-                <w:color w:val="333333"/>
-                <w:sz w:val="20"/>
-                <w:szCs w:val="20"/>
-              </w:rPr>
-              <w:t>LI-09</w:t>
-            </w:r>
-          </w:p>
-        </w:tc>
-        <w:tc>
-          <w:tcPr>
-            <w:tcW w:w="2800" w:type="dxa"/>
-            <w:tcBorders>
-              <w:top w:val="single" w:sz="4" w:space="0" w:color="B8860B"/>
-              <w:left w:val="single" w:sz="4" w:space="0" w:color="B8860B"/>
-              <w:bottom w:val="single" w:sz="4" w:space="0" w:color="B8860B"/>
-              <w:right w:val="single" w:sz="4" w:space="0" w:color="B8860B"/>
-            </w:tcBorders>
-            <w:shd w:val="clear" w:color="auto" w:fill="FDF6E3"/>
-            <w:tcMar>
-              <w:top w:w="80" w:type="dxa"/>
-              <w:left w:w="120" w:type="dxa"/>
-              <w:bottom w:w="80" w:type="dxa"/>
-              <w:right w:w="120" w:type="dxa"/>
-            </w:tcMar>
-          </w:tcPr>
-          <w:p>
-            <w:pPr>
-              <w:spacing w:before="120" w:line="288" w:lineRule="auto"/>
-            </w:pPr>
-            <w:r>
-              <w:rPr>
-                <w:sz w:val="20"/>
-                <w:szCs w:val="20"/>
-              </w:rPr>
-              <w:t xml:space="preserve">Production-Level Meta Business Verification </w:t>
-            </w:r>
-          </w:p>
-        </w:tc>
-        <w:tc>
-          <w:tcPr>
-            <w:tcW w:w="5660" w:type="dxa"/>
-            <w:tcBorders>
-              <w:top w:val="single" w:sz="4" w:space="0" w:color="B8860B"/>
-              <w:left w:val="single" w:sz="4" w:space="0" w:color="B8860B"/>
-              <w:bottom w:val="single" w:sz="4" w:space="0" w:color="B8860B"/>
-              <w:right w:val="single" w:sz="4" w:space="0" w:color="B8860B"/>
-            </w:tcBorders>
-            <w:shd w:val="clear" w:color="auto" w:fill="FDF6E3"/>
-            <w:tcMar>
-              <w:top w:w="80" w:type="dxa"/>
-              <w:left w:w="120" w:type="dxa"/>
-              <w:bottom w:w="80" w:type="dxa"/>
-              <w:right w:w="120" w:type="dxa"/>
-            </w:tcMar>
-          </w:tcPr>
-          <w:p>
-            <w:pPr>
-              <w:spacing w:before="120" w:line="288" w:lineRule="auto"/>
-              <w:jc w:val="both"/>
-            </w:pPr>
-            <w:r>
-              <w:rPr>
-                <w:sz w:val="20"/>
-                <w:szCs w:val="20"/>
-              </w:rPr>
-              <w:t xml:space="preserve">The platform implements Facebook Lead Ads Webhooks and Messenger automated lead qualifiers utilizing Meta Developer App Sandbox/Dev environments with test accounts. Formal Meta Business Verification, official App Review approval, and live production deployment on unverified external assets are excluded. </w:t>
             </w:r>
           </w:p>
         </w:tc>
@@ -10773,7 +10574,7 @@
     </w:p>
     <w:tbl>
       <w:tblPr>
-        <w:tblStyle w:val="afa"/>
+        <w:tblStyle w:val="af9"/>
         <w:tblW w:w="9360" w:type="dxa"/>
         <w:tblInd w:w="0" w:type="dxa"/>
         <w:tblBorders>
@@ -10831,7 +10632,7 @@
     </w:p>
     <w:tbl>
       <w:tblPr>
-        <w:tblStyle w:val="afb"/>
+        <w:tblStyle w:val="afa"/>
         <w:tblW w:w="9360" w:type="dxa"/>
         <w:tblInd w:w="0" w:type="dxa"/>
         <w:tblBorders>
@@ -11504,14 +11305,6 @@
     <w:p/>
     <w:p/>
     <w:p/>
-    <w:p/>
-    <w:p/>
-    <w:p/>
-    <w:p/>
-    <w:p/>
-    <w:p/>
-    <w:p/>
-    <w:p/>
     <w:p>
       <w:pPr>
         <w:pStyle w:val="Heading1"/>
@@ -11519,12 +11312,160 @@
           <w:bottom w:val="single" w:sz="12" w:space="4" w:color="1A4A5C"/>
         </w:pBdr>
       </w:pPr>
-      <w:bookmarkStart w:id="13" w:name="_Toc232953249"/>
+      <w:bookmarkStart w:id="13" w:name="_Toc234912095"/>
       <w:r>
         <w:lastRenderedPageBreak/>
         <w:t>5. Expected Contributions &amp; Next Steps</w:t>
       </w:r>
       <w:bookmarkEnd w:id="13"/>
+    </w:p>
+    <w:tbl>
+      <w:tblPr>
+        <w:tblStyle w:val="afb"/>
+        <w:tblW w:w="9360" w:type="dxa"/>
+        <w:tblInd w:w="0" w:type="dxa"/>
+        <w:tblBorders>
+          <w:top w:val="single" w:sz="4" w:space="0" w:color="000000"/>
+          <w:left w:val="single" w:sz="4" w:space="0" w:color="000000"/>
+          <w:bottom w:val="single" w:sz="4" w:space="0" w:color="000000"/>
+          <w:right w:val="single" w:sz="4" w:space="0" w:color="000000"/>
+          <w:insideH w:val="single" w:sz="4" w:space="0" w:color="000000"/>
+          <w:insideV w:val="single" w:sz="4" w:space="0" w:color="000000"/>
+        </w:tblBorders>
+        <w:tblLayout w:type="fixed"/>
+        <w:tblLook w:val="0000" w:firstRow="0" w:lastRow="0" w:firstColumn="0" w:lastColumn="0" w:noHBand="0" w:noVBand="0"/>
+      </w:tblPr>
+      <w:tblGrid>
+        <w:gridCol w:w="9360"/>
+      </w:tblGrid>
+      <w:tr>
+        <w:tc>
+          <w:tcPr>
+            <w:tcW w:w="9360" w:type="dxa"/>
+            <w:tcBorders>
+              <w:top w:val="nil"/>
+              <w:left w:val="single" w:sz="20" w:space="0" w:color="1A6FA3"/>
+              <w:bottom w:val="nil"/>
+              <w:right w:val="nil"/>
+            </w:tcBorders>
+            <w:shd w:val="clear" w:color="auto" w:fill="EBF5FB"/>
+            <w:tcMar>
+              <w:top w:w="140" w:type="dxa"/>
+              <w:left w:w="240" w:type="dxa"/>
+              <w:bottom w:w="140" w:type="dxa"/>
+              <w:right w:w="240" w:type="dxa"/>
+            </w:tcMar>
+          </w:tcPr>
+          <w:p>
+            <w:pPr>
+              <w:spacing w:after="60"/>
+            </w:pPr>
+            <w:r>
+              <w:rPr>
+                <w:b/>
+                <w:bCs/>
+                <w:color w:val="1A6FA3"/>
+              </w:rPr>
+              <w:t>📘  Purpose of This Section</w:t>
+            </w:r>
+          </w:p>
+          <w:p>
+            <w:pPr>
+              <w:spacing w:after="40"/>
+            </w:pPr>
+            <w:r>
+              <w:rPr>
+                <w:color w:val="333333"/>
+                <w:sz w:val="20"/>
+                <w:szCs w:val="20"/>
+              </w:rPr>
+              <w:t>Describe the VALUE delivered after the product is complete — not the problem (that was Section 1).</w:t>
+            </w:r>
+          </w:p>
+          <w:p>
+            <w:pPr>
+              <w:spacing w:after="40"/>
+            </w:pPr>
+          </w:p>
+          <w:p>
+            <w:pPr>
+              <w:spacing w:after="40"/>
+            </w:pPr>
+            <w:r>
+              <w:rPr>
+                <w:color w:val="333333"/>
+                <w:sz w:val="20"/>
+                <w:szCs w:val="20"/>
+              </w:rPr>
+              <w:t>Organise contributions into three dimensions:</w:t>
+            </w:r>
+          </w:p>
+          <w:p>
+            <w:pPr>
+              <w:spacing w:after="40"/>
+            </w:pPr>
+            <w:r>
+              <w:rPr>
+                <w:color w:val="333333"/>
+                <w:sz w:val="20"/>
+                <w:szCs w:val="20"/>
+              </w:rPr>
+              <w:t xml:space="preserve">  •  For the business / organisation: operational and financial impact</w:t>
+            </w:r>
+          </w:p>
+          <w:p>
+            <w:pPr>
+              <w:spacing w:after="40"/>
+            </w:pPr>
+            <w:r>
+              <w:rPr>
+                <w:color w:val="333333"/>
+                <w:sz w:val="20"/>
+                <w:szCs w:val="20"/>
+              </w:rPr>
+              <w:t xml:space="preserve">  •  For end users: experience and capability improvements</w:t>
+            </w:r>
+          </w:p>
+          <w:p>
+            <w:pPr>
+              <w:spacing w:after="40"/>
+            </w:pPr>
+            <w:r>
+              <w:rPr>
+                <w:color w:val="333333"/>
+                <w:sz w:val="20"/>
+                <w:szCs w:val="20"/>
+              </w:rPr>
+              <w:t xml:space="preserve">  •  For the field / future research: what this work enables next</w:t>
+            </w:r>
+          </w:p>
+          <w:p>
+            <w:pPr>
+              <w:spacing w:after="40"/>
+            </w:pPr>
+          </w:p>
+          <w:p>
+            <w:r>
+              <w:rPr>
+                <w:color w:val="333333"/>
+                <w:sz w:val="20"/>
+                <w:szCs w:val="20"/>
+              </w:rPr>
+              <w:t>Avoid repeating the problem statement. Every sentence should begin with an outcome, not a feature.</w:t>
+            </w:r>
+          </w:p>
+        </w:tc>
+      </w:tr>
+    </w:tbl>
+    <w:p>
+      <w:pPr>
+        <w:pStyle w:val="Heading2"/>
+      </w:pPr>
+      <w:bookmarkStart w:id="14" w:name="_Toc234912096"/>
+      <w:r>
+        <w:t>5.1  Business &amp; Operational Impact</w:t>
+      </w:r>
+      <w:bookmarkEnd w:id="14"/>
     </w:p>
     <w:tbl>
       <w:tblPr>
@@ -11551,11 +11492,11 @@
             <w:tcW w:w="9360" w:type="dxa"/>
             <w:tcBorders>
               <w:top w:val="nil"/>
-              <w:left w:val="single" w:sz="20" w:space="0" w:color="1A6FA3"/>
+              <w:left w:val="single" w:sz="20" w:space="0" w:color="B8860B"/>
               <w:bottom w:val="nil"/>
               <w:right w:val="nil"/>
             </w:tcBorders>
-            <w:shd w:val="clear" w:color="auto" w:fill="EBF5FB"/>
+            <w:shd w:val="clear" w:color="auto" w:fill="FDF6E3"/>
             <w:tcMar>
               <w:top w:w="140" w:type="dxa"/>
               <w:left w:w="240" w:type="dxa"/>
@@ -11567,180 +11508,11 @@
             <w:pPr>
               <w:spacing w:after="60"/>
             </w:pPr>
-            <w:r>
-              <w:rPr>
-                <w:b/>
-                <w:bCs/>
-                <w:color w:val="1A6FA3"/>
-              </w:rPr>
-              <w:t>📘  Purpose of This Section</w:t>
-            </w:r>
-          </w:p>
-          <w:p>
-            <w:pPr>
-              <w:spacing w:after="40"/>
-            </w:pPr>
-            <w:r>
-              <w:rPr>
-                <w:color w:val="333333"/>
-                <w:sz w:val="20"/>
-                <w:szCs w:val="20"/>
-              </w:rPr>
-              <w:t>Describe the VALUE delivered after the product is complete — not the problem (that was Section 1).</w:t>
-            </w:r>
-          </w:p>
-          <w:p>
-            <w:pPr>
-              <w:spacing w:after="40"/>
-            </w:pPr>
-          </w:p>
-          <w:p>
-            <w:pPr>
-              <w:spacing w:after="40"/>
-            </w:pPr>
-            <w:r>
-              <w:rPr>
-                <w:color w:val="333333"/>
-                <w:sz w:val="20"/>
-                <w:szCs w:val="20"/>
-              </w:rPr>
-              <w:t>Organise contributions into three dimensions:</w:t>
-            </w:r>
-          </w:p>
-          <w:p>
-            <w:pPr>
-              <w:spacing w:after="40"/>
-            </w:pPr>
-            <w:r>
-              <w:rPr>
-                <w:color w:val="333333"/>
-                <w:sz w:val="20"/>
-                <w:szCs w:val="20"/>
-              </w:rPr>
-              <w:t xml:space="preserve">  •  For the business / organisation: operational and financial impact</w:t>
-            </w:r>
-          </w:p>
-          <w:p>
-            <w:pPr>
-              <w:spacing w:after="40"/>
-            </w:pPr>
-            <w:r>
-              <w:rPr>
-                <w:color w:val="333333"/>
-                <w:sz w:val="20"/>
-                <w:szCs w:val="20"/>
-              </w:rPr>
-              <w:t xml:space="preserve">  •  For end users: experience and capability improvements</w:t>
-            </w:r>
-          </w:p>
-          <w:p>
-            <w:pPr>
-              <w:spacing w:after="40"/>
-            </w:pPr>
-            <w:r>
-              <w:rPr>
-                <w:color w:val="333333"/>
-                <w:sz w:val="20"/>
-                <w:szCs w:val="20"/>
-              </w:rPr>
-              <w:t xml:space="preserve">  •  For the field / future research: what this work enables next</w:t>
-            </w:r>
-          </w:p>
-          <w:p>
-            <w:pPr>
-              <w:spacing w:after="40"/>
-            </w:pPr>
-          </w:p>
-          <w:p>
-            <w:r>
-              <w:rPr>
-                <w:color w:val="333333"/>
-                <w:sz w:val="20"/>
-                <w:szCs w:val="20"/>
-              </w:rPr>
-              <w:t>Avoid repeating the problem statement. Every sentence should begin with an outcome, not a feature.</w:t>
-            </w:r>
-          </w:p>
-        </w:tc>
-      </w:tr>
-    </w:tbl>
-    <w:p>
-      <w:pPr>
-        <w:pStyle w:val="Heading2"/>
-      </w:pPr>
-      <w:bookmarkStart w:id="14" w:name="_Toc232953250"/>
-      <w:r>
-        <w:t>5.1  Business &amp; Operational Impact</w:t>
-      </w:r>
-      <w:bookmarkEnd w:id="14"/>
-    </w:p>
-    <w:p>
-      <w:pPr>
-        <w:spacing w:before="60" w:after="60"/>
-      </w:pPr>
-      <w:r>
-        <w:rPr>
-          <w:i/>
-          <w:iCs/>
-          <w:color w:val="666666"/>
-          <w:sz w:val="20"/>
-          <w:szCs w:val="20"/>
-        </w:rPr>
-        <w:t>Describe measurable operational improvements for the organisation or business owner.</w:t>
-      </w:r>
-    </w:p>
-    <w:p>
-      <w:pPr>
-        <w:spacing w:before="80"/>
-      </w:pPr>
-    </w:p>
-    <w:tbl>
-      <w:tblPr>
-        <w:tblStyle w:val="afd"/>
-        <w:tblW w:w="9360" w:type="dxa"/>
-        <w:tblInd w:w="0" w:type="dxa"/>
-        <w:tblBorders>
-          <w:top w:val="single" w:sz="4" w:space="0" w:color="000000"/>
-          <w:left w:val="single" w:sz="4" w:space="0" w:color="000000"/>
-          <w:bottom w:val="single" w:sz="4" w:space="0" w:color="000000"/>
-          <w:right w:val="single" w:sz="4" w:space="0" w:color="000000"/>
-          <w:insideH w:val="single" w:sz="4" w:space="0" w:color="000000"/>
-          <w:insideV w:val="single" w:sz="4" w:space="0" w:color="000000"/>
-        </w:tblBorders>
-        <w:tblLayout w:type="fixed"/>
-        <w:tblLook w:val="0000" w:firstRow="0" w:lastRow="0" w:firstColumn="0" w:lastColumn="0" w:noHBand="0" w:noVBand="0"/>
-      </w:tblPr>
-      <w:tblGrid>
-        <w:gridCol w:w="9360"/>
-      </w:tblGrid>
-      <w:tr>
-        <w:tc>
-          <w:tcPr>
-            <w:tcW w:w="9360" w:type="dxa"/>
-            <w:tcBorders>
-              <w:top w:val="nil"/>
-              <w:left w:val="single" w:sz="20" w:space="0" w:color="B8860B"/>
-              <w:bottom w:val="nil"/>
-              <w:right w:val="nil"/>
-            </w:tcBorders>
-            <w:shd w:val="clear" w:color="auto" w:fill="FDF6E3"/>
-            <w:tcMar>
-              <w:top w:w="140" w:type="dxa"/>
-              <w:left w:w="240" w:type="dxa"/>
-              <w:bottom w:w="140" w:type="dxa"/>
-              <w:right w:w="240" w:type="dxa"/>
-            </w:tcMar>
-          </w:tcPr>
-          <w:p>
-            <w:pPr>
-              <w:spacing w:after="60"/>
-            </w:pPr>
             <w:sdt>
               <w:sdtPr>
                 <w:tag w:val="goog_rdk_6"/>
-                <w:id w:val="139916957"/>
+                <w:id w:val="1837403180"/>
               </w:sdtPr>
-              <w:sdtEndPr/>
               <w:sdtContent>
                 <w:r>
                   <w:rPr>
@@ -11782,12 +11554,7 @@
     </w:tbl>
     <w:p>
       <w:pPr>
-        <w:spacing w:before="80"/>
-      </w:pPr>
-    </w:p>
-    <w:p>
-      <w:pPr>
-        <w:spacing w:after="240" w:line="276" w:lineRule="auto"/>
+        <w:spacing w:before="240" w:after="240" w:line="276" w:lineRule="auto"/>
         <w:jc w:val="both"/>
       </w:pPr>
       <w:r>
@@ -11796,34 +11563,34 @@
     </w:p>
     <w:p>
       <w:pPr>
-        <w:spacing w:after="240" w:line="276" w:lineRule="auto"/>
+        <w:spacing w:before="240" w:after="240" w:line="276" w:lineRule="auto"/>
         <w:jc w:val="both"/>
       </w:pPr>
       <w:r>
-        <w:t>By operating as a Hybrid Marketplace and automated Lead Generation CRM tool, the platform bridges the gap between fragmented social networks and centralized management. For the tutor centers, the automated Social Data Scraping, NLP Parsing, and Lead Routing engines eliminate up to 70% of manual social media monitoring and copy-pasting time. Instead of spending hours hunting through chaotic Facebook groups, tutor centers receive a clean, structured, and deduplicated queue of potential clients (Leads) directly on their dashboards, shortening the lead-to-class publication lifecycle from days to less than 15 minutes.</w:t>
+        <w:t>By operating as a Hybrid Organic Marketplace and B2B SaaS CRM tool, the platform bridges the gap between independent market participants and institutional providers. For the tutor centers, the Bulk Excel Data Processing Engine, Internal Tutor Assignment, and Automated Recruitment Pipelines eliminate up to 70% of manual administrative and data-re-entry time. Instead of spending hours managing disjointed student records, spreadsheets, and candidate applications, tutor centers leverage a clean, structured, and centralized digital workflow, shortening the recruitment-to-onboarding and class allocation lifecycle from days to less than 15 minutes.</w:t>
       </w:r>
     </w:p>
     <w:p>
       <w:pPr>
-        <w:spacing w:after="240" w:line="276" w:lineRule="auto"/>
+        <w:spacing w:before="240" w:after="240" w:line="276" w:lineRule="auto"/>
         <w:jc w:val="both"/>
       </w:pPr>
       <w:r>
-        <w:t>The implementation of the Smart Escrow Wallet and Auto-Contract Generation introduces an unalterable digital workflow that protects the platform ecosystem. By freezing tuition deposits in a secure escrow state via real-time payment Webhooks, the platform reduces financial fraud, deposit scams, and cashing-out disputes by an estimated 90%. Furthermore, automated refund business rules significantly decrease the administrative workload for platform administrators, who previously spent 5 to 8 hours per week manually auditing canceled classes and resolving interpersonal payment disputes.</w:t>
+        <w:t>The implementation of the Multi-Party E-Contract Signing Portal and Smart Escrow Wallet introduces an unalterable digital workflow that protects the platform ecosystem. By freezing tuition deposits in a secure escrow state via real-time payment Webhooks only after all parties digitally execute the contract, the platform reduces financial fraud, deposit scams, and platform circumvention by an estimated 90%. Furthermore, automated refund business rules and the Circumvention &amp; Anomaly Detection Engine significantly decrease the administrative workload for platform administrators, who previously spent 5 to 8 hours per week manually auditing canceled classes, flagging chat violations, and resolving interpersonal payment disputes.</w:t>
       </w:r>
     </w:p>
     <w:p>
       <w:pPr>
-        <w:spacing w:after="240" w:line="276" w:lineRule="auto"/>
+        <w:spacing w:before="240" w:after="240" w:line="276" w:lineRule="auto"/>
         <w:jc w:val="both"/>
       </w:pPr>
       <w:r>
-        <w:t>Ultimately, the digital verification matrix for tutor profiles and provider corporate licenses establishes an auditable trust mechanism. By centralizing qualification checks, the platform maintains a high service standard, minimizes manual verification overhead for admins, and provides data-driven visibility into lead conversion velocity per region—a metric completely unavailable in legacy systems.</w:t>
+        <w:t>Ultimately, the digital verification matrix for tutor profiles and provider corporate licenses establishes an auditable trust mechanism. By centralizing qualification checks and cross-referencing data within the core CRM, the platform maintains a high service standard, minimizes manual verification overhead for admins, and provides data-driven visibility into class pipeline conversion velocity per center—a metric completely unavailable in legacy systems.</w:t>
       </w:r>
     </w:p>
     <w:p>
       <w:pPr>
-        <w:spacing w:after="240" w:line="276" w:lineRule="auto"/>
+        <w:spacing w:before="240" w:after="240" w:line="276" w:lineRule="auto"/>
         <w:jc w:val="both"/>
       </w:pPr>
     </w:p>
@@ -11831,7 +11598,7 @@
       <w:pPr>
         <w:pStyle w:val="Heading2"/>
       </w:pPr>
-      <w:bookmarkStart w:id="15" w:name="_Toc232953251"/>
+      <w:bookmarkStart w:id="15" w:name="_Toc234912097"/>
       <w:r>
         <w:lastRenderedPageBreak/>
         <w:t>5.2  User Experience Impact</w:t>
@@ -11860,7 +11627,7 @@
     </w:p>
     <w:tbl>
       <w:tblPr>
-        <w:tblStyle w:val="aff"/>
+        <w:tblStyle w:val="afd"/>
         <w:tblW w:w="9360" w:type="dxa"/>
         <w:tblInd w:w="0" w:type="dxa"/>
         <w:tblBorders>
@@ -11902,9 +11669,8 @@
             <w:sdt>
               <w:sdtPr>
                 <w:tag w:val="goog_rdk_7"/>
-                <w:id w:val="44104155"/>
+                <w:id w:val="-1885011428"/>
               </w:sdtPr>
-              <w:sdtEndPr/>
               <w:sdtContent>
                 <w:r>
                   <w:rPr>
@@ -11938,7 +11704,7 @@
     </w:p>
     <w:tbl>
       <w:tblPr>
-        <w:tblStyle w:val="aff0"/>
+        <w:tblStyle w:val="afe"/>
         <w:tblW w:w="9360" w:type="dxa"/>
         <w:tblInd w:w="0" w:type="dxa"/>
         <w:tblBorders>
@@ -12004,11 +11770,31 @@
     </w:tbl>
     <w:p>
       <w:pPr>
-        <w:spacing w:after="240" w:line="276" w:lineRule="auto"/>
+        <w:spacing w:before="240" w:after="240" w:line="276" w:lineRule="auto"/>
         <w:jc w:val="both"/>
       </w:pPr>
       <w:r>
         <w:t>The product radically improves the daily operational experience for all core stakeholders by consolidating distributed activities into a single, seamless digital ecosystem:</w:t>
+      </w:r>
+    </w:p>
+    <w:p>
+      <w:pPr>
+        <w:numPr>
+          <w:ilvl w:val="0"/>
+          <w:numId w:val="1"/>
+        </w:numPr>
+        <w:spacing w:before="240" w:line="276" w:lineRule="auto"/>
+        <w:jc w:val="both"/>
+      </w:pPr>
+      <w:r>
+        <w:rPr>
+          <w:b/>
+          <w:bCs/>
+        </w:rPr>
+        <w:t>Clients (Parents and Students)</w:t>
+      </w:r>
+      <w:r>
+        <w:t>: Gain immediate access to highly compatible tutors through an interactive, Dynamic Weight Tuning UI. Through the Dependent Profile Linker, parents can effortlessly manage and monitor multiple child profiles under a single account. Instead of passively waiting for recommendations, clients use intuitive sliders to instantly prioritize what matters to them (e.g., specific teaching styles, budget ranges, or proximity). This transparency eliminates the stress of blind selection and personal bias.</w:t>
       </w:r>
     </w:p>
     <w:p>
@@ -12025,10 +11811,10 @@
           <w:b/>
           <w:bCs/>
         </w:rPr>
-        <w:t>Clients (Parents and Students):</w:t>
+        <w:t>Tutors</w:t>
       </w:r>
       <w:r>
-        <w:t xml:space="preserve"> Gain immediate access to highly compatible tutors through an interactive, Dynamic Weight Tuning UI. Instead of passively waiting for recommendations or dealing with intrusive post-match academic surveillance, clients use intuitive sliders to instantly prioritize what matters to them (e.g., specific teaching styles, budget ranges, or proximity). This transparency eliminates the stress of blind selection and personal bias.</w:t>
+        <w:t>: Benefit from enhanced digital visibility and an uncorruptible professional reputation system. Tutors can ditch multi-channel browsing; they gain a centralized application pipeline with real-time status updates for both organic classes and center recruitment campaigns. Most importantly, the integrated Smart Escrow Wallet guarantees that their hard-earned tuition fees are securely escrowed and automatically disbursed upon milestone completion, completely eradicating the risk of parent-side payment defaults.</w:t>
       </w:r>
     </w:p>
     <w:p>
@@ -12045,30 +11831,10 @@
           <w:b/>
           <w:bCs/>
         </w:rPr>
-        <w:t>Tutors:</w:t>
+        <w:t>Tutor Centers</w:t>
       </w:r>
       <w:r>
-        <w:t xml:space="preserve"> Benefit from enhanced digital visibility and an uncorruptible professional reputation system. Tutors can ditch multi-channel browsing; they gain a centralized application pipeline with real-time status updates. Most importantly, the integrated virtual wallet guarantees that their hard-earned tuition fees are securely escrowed and automatically disbursed upon milestone completion, completely eradicating the risk of parent-side payment defaults.</w:t>
-      </w:r>
-    </w:p>
-    <w:p>
-      <w:pPr>
-        <w:numPr>
-          <w:ilvl w:val="0"/>
-          <w:numId w:val="1"/>
-        </w:numPr>
-        <w:spacing w:line="276" w:lineRule="auto"/>
-        <w:jc w:val="both"/>
-      </w:pPr>
-      <w:r>
-        <w:rPr>
-          <w:b/>
-          <w:bCs/>
-        </w:rPr>
-        <w:t>Tutor Centers:</w:t>
-      </w:r>
-      <w:r>
-        <w:t xml:space="preserve"> Experience a shift from chaotic coordination to structured CRM workflows. They no longer have to mentally track cross-posted inquiries across WhatsApp, Zalo, and Facebook. Providers operate from a dedicated workspace where they can instantly call and validate incoming unverified leads, convert them into official platform classes with one click, and manage tutor matching efficiently.</w:t>
+        <w:t>: Experience a shift from chaotic coordination to structured CRM workflows. Through the Center Sub-Account Console, owners can easily delegate tasks and manage access control for internal staff. They no longer have to mentally track fragmented student records and paper contracts. Providers operate from a dedicated workspace where they can import datasets via the Bulk Excel Engine, instantly execute Internal Tutor Assignments, process high-volume recruitment pipelines, and digitally finalize bindings using the E-Contract Signing Portal.</w:t>
       </w:r>
     </w:p>
     <w:p>
@@ -12085,39 +11851,21 @@
           <w:b/>
           <w:bCs/>
         </w:rPr>
-        <w:t>Platform Administrators:</w:t>
+        <w:t>Platform Administrators</w:t>
       </w:r>
       <w:r>
-        <w:t xml:space="preserve"> Replace free-form communication tracking and manual dispute intervention with a centralized dashboard. The integration of real-time payment Webhooks and automated transaction state machines provides a bird's-eye view of platform financial health, turning complex escrow accounting into a hands-free automated process.</w:t>
+        <w:t>: Replace free-form communication tracking and manual dispute intervention with a centralized dashboard. The integration of real-time payment Webhooks, automated transaction state machines, and the Circumvention &amp; Anomaly Detection Engine provides a bird's-eye view of platform financial and behavioral health, turning complex escrow accounting and platform integrity protection into a hands-free automated process.</w:t>
       </w:r>
     </w:p>
     <w:p>
       <w:pPr>
-        <w:spacing w:after="240" w:line="276" w:lineRule="auto"/>
+        <w:spacing w:before="240" w:after="240" w:line="276" w:lineRule="auto"/>
         <w:jc w:val="both"/>
       </w:pPr>
     </w:p>
     <w:p>
       <w:pPr>
-        <w:spacing w:after="240" w:line="276" w:lineRule="auto"/>
-        <w:jc w:val="both"/>
-      </w:pPr>
-    </w:p>
-    <w:p>
-      <w:pPr>
-        <w:spacing w:after="240" w:line="276" w:lineRule="auto"/>
-        <w:jc w:val="both"/>
-      </w:pPr>
-    </w:p>
-    <w:p>
-      <w:pPr>
-        <w:spacing w:after="240" w:line="276" w:lineRule="auto"/>
-        <w:jc w:val="both"/>
-      </w:pPr>
-    </w:p>
-    <w:p>
-      <w:pPr>
-        <w:spacing w:after="240" w:line="276" w:lineRule="auto"/>
+        <w:spacing w:before="240" w:after="240" w:line="276" w:lineRule="auto"/>
         <w:jc w:val="both"/>
       </w:pPr>
     </w:p>
@@ -12125,7 +11873,7 @@
       <w:pPr>
         <w:pStyle w:val="Heading2"/>
       </w:pPr>
-      <w:bookmarkStart w:id="16" w:name="_Toc232953252"/>
+      <w:bookmarkStart w:id="16" w:name="_Toc234912098"/>
       <w:r>
         <w:lastRenderedPageBreak/>
         <w:t>5.3  Planned Next Steps After Project Completion</w:t>
@@ -12154,7 +11902,7 @@
     </w:p>
     <w:tbl>
       <w:tblPr>
-        <w:tblStyle w:val="aff1"/>
+        <w:tblStyle w:val="aff"/>
         <w:tblW w:w="9360" w:type="dxa"/>
         <w:tblInd w:w="0" w:type="dxa"/>
         <w:tblBorders>
@@ -12196,9 +11944,8 @@
             <w:sdt>
               <w:sdtPr>
                 <w:tag w:val="goog_rdk_8"/>
-                <w:id w:val="596521386"/>
+                <w:id w:val="321676244"/>
               </w:sdtPr>
-              <w:sdtEndPr/>
               <w:sdtContent>
                 <w:r>
                   <w:rPr>
@@ -12232,7 +11979,7 @@
     </w:p>
     <w:tbl>
       <w:tblPr>
-        <w:tblStyle w:val="aff2"/>
+        <w:tblStyle w:val="aff0"/>
         <w:tblW w:w="9360" w:type="dxa"/>
         <w:tblInd w:w="0" w:type="dxa"/>
         <w:tblBorders>
@@ -12391,16 +12138,20 @@
     </w:tbl>
     <w:p>
       <w:pPr>
-        <w:spacing w:after="240" w:line="276" w:lineRule="auto"/>
+        <w:spacing w:before="240" w:after="240" w:line="276" w:lineRule="auto"/>
         <w:jc w:val="both"/>
       </w:pPr>
       <w:r>
-        <w:t>Following the successful deployment and evaluation of Version 1 (incorporating the Core Lead CRM Engine and Sandbox Escrow System), the planned next steps to scale TCS  into a comprehensive educational ecosystem include:</w:t>
+        <w:t>Following the successful deployment and evaluation of Version 1 (incorporating the Core Marketplace CRM Engine and Sandbox Escrow System), the planned next steps to scale TCS into a comprehensive educational ecosystem include:</w:t>
       </w:r>
     </w:p>
     <w:p>
       <w:pPr>
-        <w:spacing w:after="240" w:line="276" w:lineRule="auto"/>
+        <w:numPr>
+          <w:ilvl w:val="0"/>
+          <w:numId w:val="2"/>
+        </w:numPr>
+        <w:spacing w:before="240" w:line="276" w:lineRule="auto"/>
         <w:jc w:val="both"/>
       </w:pPr>
       <w:r>
@@ -12408,15 +12159,19 @@
           <w:b/>
           <w:bCs/>
         </w:rPr>
-        <w:t>(i) Multi-Channel Integration Expansion:</w:t>
+        <w:t>(i) Multi-Tenant Institutional Expansion:</w:t>
       </w:r>
       <w:r>
-        <w:t xml:space="preserve"> Integrating additional automated scraping hooks and public APIs for alternative localized platforms (such as TikTok Education communities and Zalo mini-apps) to cast a wider net for source lead ingestion.</w:t>
+        <w:t xml:space="preserve"> Developing dedicated enterprise-grade white-label sub-portals and open API gateways for large-scale educational academies and franchise tutoring centers. This allows external institutional networks to seamlessly sync their existing offline ERP systems directly into the TCS core CRM infrastructure.</w:t>
       </w:r>
     </w:p>
     <w:p>
       <w:pPr>
-        <w:spacing w:after="240" w:line="276" w:lineRule="auto"/>
+        <w:numPr>
+          <w:ilvl w:val="0"/>
+          <w:numId w:val="2"/>
+        </w:numPr>
+        <w:spacing w:line="276" w:lineRule="auto"/>
         <w:jc w:val="both"/>
       </w:pPr>
       <w:r>
@@ -12427,11 +12182,35 @@
         <w:t>(ii) Advanced Production-Level Financial Rails:</w:t>
       </w:r>
       <w:r>
-        <w:t xml:space="preserve"> Transitioning from the SePay Developer Sandbox environment into full commercial banking production integrations upon establishing a formal legal corporate entity.</w:t>
+        <w:t xml:space="preserve"> Transitioning from the SePay/Payment Gateways Developer Sandbox environment into full commercial banking production integrations and automated multi-party split-payment settlements upon establishing a formal legal corporate entity.</w:t>
       </w:r>
     </w:p>
     <w:p>
       <w:pPr>
+        <w:numPr>
+          <w:ilvl w:val="0"/>
+          <w:numId w:val="2"/>
+        </w:numPr>
+        <w:spacing w:line="276" w:lineRule="auto"/>
+        <w:jc w:val="both"/>
+      </w:pPr>
+      <w:r>
+        <w:rPr>
+          <w:b/>
+          <w:bCs/>
+        </w:rPr>
+        <w:t>(iii) Predictive AI Analytics for Market Matchmaking:</w:t>
+      </w:r>
+      <w:r>
+        <w:t xml:space="preserve"> Utilizing clean, historical in-platform market data (such as class completion rates, dispute ratios, and scheduling discipline) to build predictive machine learning models. These models will automatically optimize the Dynamic Weight Tuning Engine and suggest highly competitive, market-driven tuition fee ranges for newly created classes based on real-time supply and demand parameters.</w:t>
+      </w:r>
+    </w:p>
+    <w:p>
+      <w:pPr>
+        <w:numPr>
+          <w:ilvl w:val="0"/>
+          <w:numId w:val="2"/>
+        </w:numPr>
         <w:spacing w:after="240" w:line="276" w:lineRule="auto"/>
         <w:jc w:val="both"/>
       </w:pPr>
@@ -12440,26 +12219,10 @@
           <w:b/>
           <w:bCs/>
         </w:rPr>
-        <w:t>(iii) Predictive AI Analytics for Lead Pricing:</w:t>
+        <w:t>(iv) Biometric and National ID Verification (eKYC):</w:t>
       </w:r>
       <w:r>
-        <w:t xml:space="preserve"> Utilizing historical market data to build predictive machine learning models that automatically suggest optimal, competitive tuition fee ranges for incoming unverified social leads based on historical region and subject parameters.</w:t>
-      </w:r>
-    </w:p>
-    <w:p>
-      <w:pPr>
-        <w:spacing w:after="240" w:line="276" w:lineRule="auto"/>
-        <w:jc w:val="both"/>
-      </w:pPr>
-      <w:r>
-        <w:rPr>
-          <w:b/>
-          <w:bCs/>
-        </w:rPr>
-        <w:t>(iv) Biometric and National ID Verification:</w:t>
-      </w:r>
-      <w:r>
-        <w:t xml:space="preserve"> Enhancing the digital profile verification engine by integrating with national electronic identification standards (e.g., eKYC systems or chip-based citizen ID card readers) to achieve absolute zero-trust credential validation for onboarding tutors.</w:t>
+        <w:t xml:space="preserve"> Enhancing the digital profile verification matrix by integrating with institutional electronic identification standards (such as chip-based citizen ID card reader systems or national eKYC verification gateways) to achieve absolute zero-trust credential validation for onboarding individual tutors and center representatives.</w:t>
       </w:r>
     </w:p>
     <w:p>
@@ -12653,9 +12416,9 @@
 <file path=word/numbering.xml><?xml version="1.0" encoding="utf-8"?>
 <w:numbering xmlns:wpc="http://schemas.microsoft.com/office/word/2010/wordprocessingCanvas" xmlns:cx="http://schemas.microsoft.com/office/drawing/2014/chartex" xmlns:cx1="http://schemas.microsoft.com/office/drawing/2015/9/8/chartex" xmlns:cx2="http://schemas.microsoft.com/office/drawing/2015/10/21/chartex" xmlns:cx3="http://schemas.microsoft.com/office/drawing/2016/5/9/chartex" xmlns:cx4="http://schemas.microsoft.com/office/drawing/2016/5/10/chartex" xmlns:cx5="http://schemas.microsoft.com/office/drawing/2016/5/11/chartex" xmlns:cx6="http://schemas.microsoft.com/office/drawing/2016/5/12/chartex" xmlns:cx7="http://schemas.microsoft.com/office/drawing/2016/5/13/chartex" xmlns:cx8="http://schemas.microsoft.com/office/drawing/2016/5/14/chartex" xmlns:mc="http://schemas.openxmlformats.org/markup-compatibility/2006" xmlns:aink="http://schemas.microsoft.com/office/drawing/2016/ink" xmlns:am3d="http://schemas.microsoft.com/office/drawing/2017/model3d" xmlns:o="urn:schemas-microsoft-com:office:office" xmlns:r="http://schemas.openxmlformats.org/officeDocument/2006/relationships" xmlns:m="http://schemas.openxmlformats.org/officeDocument/2006/math" xmlns:v="urn:schemas-microsoft-com:vml" xmlns:wp14="http://schemas.microsoft.com/office/word/2010/wordprocessingDrawing" xmlns:wp="http://schemas.openxmlformats.org/drawingml/2006/wordprocessingDrawing" xmlns:w10="urn:schemas-microsoft-com:office:word" xmlns:w="http://schemas.openxmlformats.org/wordprocessingml/2006/main" xmlns:w14="http://schemas.microsoft.com/office/word/2010/wordml" xmlns:w15="http://schemas.microsoft.com/office/word/2012/wordml" xmlns:w16cex="http://schemas.microsoft.com/office/word/2018/wordml/cex" xmlns:w16cid="http://schemas.microsoft.com/office/word/2016/wordml/cid" xmlns:w16="http://schemas.microsoft.com/office/word/2018/wordml" xmlns:w16se="http://schemas.microsoft.com/office/word/2015/wordml/symex" xmlns:wpg="http://schemas.microsoft.com/office/word/2010/wordprocessingGroup" xmlns:wpi="http://schemas.microsoft.com/office/word/2010/wordprocessingInk" xmlns:wne="http://schemas.microsoft.com/office/word/2006/wordml" xmlns:wps="http://schemas.microsoft.com/office/word/2010/wordprocessingShape" mc:Ignorable="w14 w15 w16se w16cid w16 w16cex wp14">
   <w:abstractNum w:abstractNumId="0" w15:restartNumberingAfterBreak="0">
-    <w:nsid w:val="68915E6E"/>
+    <w:nsid w:val="10F36ADC"/>
     <w:multiLevelType w:val="multilevel"/>
-    <w:tmpl w:val="D6645220"/>
+    <w:tmpl w:val="A67ED8EE"/>
     <w:lvl w:ilvl="0">
       <w:start w:val="1"/>
       <w:numFmt w:val="bullet"/>
@@ -12665,7 +12428,119 @@
         <w:ind w:left="720" w:hanging="360"/>
       </w:pPr>
       <w:rPr>
-        <w:rFonts w:ascii="Arial" w:eastAsia="Arial" w:hAnsi="Arial" w:cs="Arial"/>
+        <w:u w:val="none"/>
+      </w:rPr>
+    </w:lvl>
+    <w:lvl w:ilvl="1">
+      <w:start w:val="1"/>
+      <w:numFmt w:val="bullet"/>
+      <w:lvlText w:val="○"/>
+      <w:lvlJc w:val="left"/>
+      <w:pPr>
+        <w:ind w:left="1440" w:hanging="360"/>
+      </w:pPr>
+      <w:rPr>
+        <w:u w:val="none"/>
+      </w:rPr>
+    </w:lvl>
+    <w:lvl w:ilvl="2">
+      <w:start w:val="1"/>
+      <w:numFmt w:val="bullet"/>
+      <w:lvlText w:val="■"/>
+      <w:lvlJc w:val="left"/>
+      <w:pPr>
+        <w:ind w:left="2160" w:hanging="360"/>
+      </w:pPr>
+      <w:rPr>
+        <w:u w:val="none"/>
+      </w:rPr>
+    </w:lvl>
+    <w:lvl w:ilvl="3">
+      <w:start w:val="1"/>
+      <w:numFmt w:val="bullet"/>
+      <w:lvlText w:val="●"/>
+      <w:lvlJc w:val="left"/>
+      <w:pPr>
+        <w:ind w:left="2880" w:hanging="360"/>
+      </w:pPr>
+      <w:rPr>
+        <w:u w:val="none"/>
+      </w:rPr>
+    </w:lvl>
+    <w:lvl w:ilvl="4">
+      <w:start w:val="1"/>
+      <w:numFmt w:val="bullet"/>
+      <w:lvlText w:val="○"/>
+      <w:lvlJc w:val="left"/>
+      <w:pPr>
+        <w:ind w:left="3600" w:hanging="360"/>
+      </w:pPr>
+      <w:rPr>
+        <w:u w:val="none"/>
+      </w:rPr>
+    </w:lvl>
+    <w:lvl w:ilvl="5">
+      <w:start w:val="1"/>
+      <w:numFmt w:val="bullet"/>
+      <w:lvlText w:val="■"/>
+      <w:lvlJc w:val="left"/>
+      <w:pPr>
+        <w:ind w:left="4320" w:hanging="360"/>
+      </w:pPr>
+      <w:rPr>
+        <w:u w:val="none"/>
+      </w:rPr>
+    </w:lvl>
+    <w:lvl w:ilvl="6">
+      <w:start w:val="1"/>
+      <w:numFmt w:val="bullet"/>
+      <w:lvlText w:val="●"/>
+      <w:lvlJc w:val="left"/>
+      <w:pPr>
+        <w:ind w:left="5040" w:hanging="360"/>
+      </w:pPr>
+      <w:rPr>
+        <w:u w:val="none"/>
+      </w:rPr>
+    </w:lvl>
+    <w:lvl w:ilvl="7">
+      <w:start w:val="1"/>
+      <w:numFmt w:val="bullet"/>
+      <w:lvlText w:val="○"/>
+      <w:lvlJc w:val="left"/>
+      <w:pPr>
+        <w:ind w:left="5760" w:hanging="360"/>
+      </w:pPr>
+      <w:rPr>
+        <w:u w:val="none"/>
+      </w:rPr>
+    </w:lvl>
+    <w:lvl w:ilvl="8">
+      <w:start w:val="1"/>
+      <w:numFmt w:val="bullet"/>
+      <w:lvlText w:val="■"/>
+      <w:lvlJc w:val="left"/>
+      <w:pPr>
+        <w:ind w:left="6480" w:hanging="360"/>
+      </w:pPr>
+      <w:rPr>
+        <w:u w:val="none"/>
+      </w:rPr>
+    </w:lvl>
+  </w:abstractNum>
+  <w:abstractNum w:abstractNumId="1" w15:restartNumberingAfterBreak="0">
+    <w:nsid w:val="6DC72A22"/>
+    <w:multiLevelType w:val="multilevel"/>
+    <w:tmpl w:val="2D2444DE"/>
+    <w:lvl w:ilvl="0">
+      <w:start w:val="1"/>
+      <w:numFmt w:val="bullet"/>
+      <w:lvlText w:val="●"/>
+      <w:lvlJc w:val="left"/>
+      <w:pPr>
+        <w:ind w:left="720" w:hanging="360"/>
+      </w:pPr>
+      <w:rPr>
         <w:u w:val="none"/>
       </w:rPr>
     </w:lvl>
@@ -12768,6 +12643,9 @@
   </w:abstractNum>
   <w:num w:numId="1">
     <w:abstractNumId w:val="0"/>
+  </w:num>
+  <w:num w:numId="2">
+    <w:abstractNumId w:val="1"/>
   </w:num>
 </w:numbering>
 </file>
@@ -13834,32 +13712,6 @@
       </w:tblCellMar>
     </w:tblPr>
   </w:style>
-  <w:style w:type="table" w:customStyle="1" w:styleId="aff1">
-    <w:basedOn w:val="TableNormal0"/>
-    <w:tblPr>
-      <w:tblStyleRowBandSize w:val="1"/>
-      <w:tblStyleColBandSize w:val="1"/>
-      <w:tblCellMar>
-        <w:top w:w="0" w:type="dxa"/>
-        <w:left w:w="10" w:type="dxa"/>
-        <w:bottom w:w="0" w:type="dxa"/>
-        <w:right w:w="10" w:type="dxa"/>
-      </w:tblCellMar>
-    </w:tblPr>
-  </w:style>
-  <w:style w:type="table" w:customStyle="1" w:styleId="aff2">
-    <w:basedOn w:val="TableNormal0"/>
-    <w:tblPr>
-      <w:tblStyleRowBandSize w:val="1"/>
-      <w:tblStyleColBandSize w:val="1"/>
-      <w:tblCellMar>
-        <w:top w:w="0" w:type="dxa"/>
-        <w:left w:w="10" w:type="dxa"/>
-        <w:bottom w:w="0" w:type="dxa"/>
-        <w:right w:w="10" w:type="dxa"/>
-      </w:tblCellMar>
-    </w:tblPr>
-  </w:style>
   <w:style w:type="paragraph" w:styleId="TOC1">
     <w:name w:val="toc 1"/>
     <w:basedOn w:val="Normal"/>
@@ -13867,7 +13719,7 @@
     <w:autoRedefine/>
     <w:uiPriority w:val="39"/>
     <w:unhideWhenUsed/>
-    <w:rsid w:val="00B7713E"/>
+    <w:rsid w:val="00C37A42"/>
     <w:pPr>
       <w:spacing w:after="100"/>
     </w:pPr>
@@ -13879,7 +13731,7 @@
     <w:autoRedefine/>
     <w:uiPriority w:val="39"/>
     <w:unhideWhenUsed/>
-    <w:rsid w:val="00B7713E"/>
+    <w:rsid w:val="00C37A42"/>
     <w:pPr>
       <w:spacing w:after="100"/>
       <w:ind w:left="220"/>
@@ -13890,7 +13742,7 @@
     <w:basedOn w:val="DefaultParagraphFont"/>
     <w:uiPriority w:val="99"/>
     <w:unhideWhenUsed/>
-    <w:rsid w:val="00B7713E"/>
+    <w:rsid w:val="00C37A42"/>
     <w:rPr>
       <w:color w:val="0000FF" w:themeColor="hyperlink"/>
       <w:u w:val="single"/>
@@ -14221,7 +14073,7 @@
 
 <file path=customXml/item1.xml><?xml version="1.0" encoding="utf-8"?>
 <go:gDocsCustomXmlDataStorage xmlns:go="http://customooxmlschemas.google.com/" xmlns:r="http://schemas.openxmlformats.org/officeDocument/2006/relationships" uri="GoogleDocsCustomDataVersion2">
-  <go:docsCustomData xmlns:go="http://customooxmlschemas.google.com/" roundtripDataSignature="AMtx7mhv8EIz/k9ONFvh2WoIRX2faAqc/w==">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</go:docsCustomData>
+  <go:docsCustomData xmlns:go="http://customooxmlschemas.google.com/" roundtripDataSignature="AMtx7mgi+2CUKxjNDaOPOWPemZ25pnl9CQ==">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</go:docsCustomData>
 </go:gDocsCustomXmlDataStorage>
 </file>
 

</xml_diff>

<commit_message>
hoàn thiện bf09 bf10
</commit_message>
<xml_diff>
--- a/docs/Report_1_VS.docx
+++ b/docs/Report_1_VS.docx
@@ -229,7 +229,7 @@
                 <w:sz w:val="18"/>
                 <w:szCs w:val="18"/>
               </w:rPr>
-              <w:t>v1.4</w:t>
+              <w:t>v1.5</w:t>
             </w:r>
           </w:p>
         </w:tc>
@@ -290,7 +290,7 @@
                 <w:sz w:val="18"/>
                 <w:szCs w:val="18"/>
               </w:rPr>
-              <w:t>01/07/2026</w:t>
+              <w:t>12/08/2026</w:t>
             </w:r>
           </w:p>
         </w:tc>
@@ -1119,6 +1119,48 @@
                 <w:szCs w:val="20"/>
               </w:rPr>
               <w:t xml:space="preserve">Replaced all Facebook scraping features with a clean Organic Marketplace &amp; B2B SaaS CRM </w:t>
+            </w:r>
+          </w:p>
+        </w:tc>
+      </w:tr>
+      <w:tr>
+        <w:tc>
+          <w:tcPr>
+            <w:tcW w:type="dxa" w:w="1140"/>
+          </w:tcPr>
+          <w:p>
+            <w:r>
+              <w:t>v1.5</w:t>
+            </w:r>
+          </w:p>
+        </w:tc>
+        <w:tc>
+          <w:tcPr>
+            <w:tcW w:type="dxa" w:w="1845"/>
+          </w:tcPr>
+          <w:p>
+            <w:r>
+              <w:t>12/08/2026</w:t>
+            </w:r>
+          </w:p>
+        </w:tc>
+        <w:tc>
+          <w:tcPr>
+            <w:tcW w:type="dxa" w:w="2175"/>
+          </w:tcPr>
+          <w:p>
+            <w:r>
+              <w:t>TCS Team</w:t>
+            </w:r>
+          </w:p>
+        </w:tc>
+        <w:tc>
+          <w:tcPr>
+            <w:tcW w:type="dxa" w:w="4215"/>
+          </w:tcPr>
+          <w:p>
+            <w:r>
+              <w:t>Aligned current-release data context and deferred capabilities with the implemented repository baseline.</w:t>
             </w:r>
           </w:p>
         </w:tc>
@@ -6905,7 +6947,7 @@
         <w:jc w:val="both"/>
       </w:pPr>
       <w:r>
-        <w:t>TCS operates as a Hybrid SaaS Platform that acts concurrently as an open tutoring marketplace and a robust internal Customer Relationship Management (CRM) &amp; Operations tool for tutor centers. By providing private administrative spaces, structured digital workflows, and tools like bulk Excel data exchange and internal tutor assignments, the system significantly reduces operational overhead and manual coordination efforts for partner organizations.</w:t>
+        <w:t>TCS operates as a Hybrid SaaS Platform that acts concurrently as an open tutoring marketplace and a robust internal Customer Relationship Management (CRM) &amp; Operations tool for tutor centers. By providing private administrative spaces, structured digital workflows, and tools like planned planned planned planned planned bulk Excel data exchange and internal tutor assignments, the system significantly reduces operational overhead and manual coordination efforts for partner organizations.</w:t>
       </w:r>
     </w:p>
     <w:p>
@@ -11567,7 +11609,7 @@
         <w:jc w:val="both"/>
       </w:pPr>
       <w:r>
-        <w:t>By operating as a Hybrid Organic Marketplace and B2B SaaS CRM tool, the platform bridges the gap between independent market participants and institutional providers. For the tutor centers, the Bulk Excel Data Processing Engine, Internal Tutor Assignment, and Automated Recruitment Pipelines eliminate up to 70% of manual administrative and data-re-entry time. Instead of spending hours managing disjointed student records, spreadsheets, and candidate applications, tutor centers leverage a clean, structured, and centralized digital workflow, shortening the recruitment-to-onboarding and class allocation lifecycle from days to less than 15 minutes.</w:t>
+        <w:t>By operating as a Hybrid Organic Marketplace and B2B SaaS CRM tool, the platform bridges the gap between independent market participants and institutional providers. For the tutor centers, the planned Bulk Excel Student Import/Export, Internal Tutor Assignment, and Automated Recruitment Pipelines eliminate up to 70% of manual administrative and data-re-entry time. Instead of spending hours managing disjointed student records, spreadsheets, and candidate applications, tutor centers leverage a clean, structured, and centralized digital workflow, shortening the recruitment-to-onboarding and class allocation lifecycle from days to less than 15 minutes.</w:t>
       </w:r>
     </w:p>
     <w:p>
@@ -12239,6 +12281,32 @@
           <w:szCs w:val="20"/>
         </w:rPr>
         <w:t>— End of Document —</w:t>
+      </w:r>
+    </w:p>
+    <w:p>
+      <w:pPr>
+        <w:pStyle w:val="Heading1"/>
+      </w:pPr>
+      <w:r>
+        <w:rPr>
+          <w:sz w:val="28"/>
+        </w:rPr>
+        <w:t>[DOC-CODE ALIGNMENT] Data Context Alignment Addendum</w:t>
+      </w:r>
+    </w:p>
+    <w:p>
+      <w:r>
+        <w:t>Current code baseline: TCS stores transactional data in MySQL 8 through Spring Data JPA and Flyway migrations V1-V26. The main data groups are identity/profile, verification evidence, catalog/location, marketplace/class lifecycle, center recruitment, contracts, finance, messaging/notification, AI support and platform operations/audit.</w:t>
+      </w:r>
+    </w:p>
+    <w:p>
+      <w:r>
+        <w:t>External data files in the implemented release are uploaded media and verification/evidence documents. Public avatars are served under /uploads/public/**; sensitive files are accessed through authenticated endpoints using file identifiers and owner/admin checks.</w:t>
+      </w:r>
+    </w:p>
+    <w:p>
+      <w:r>
+        <w:t>Bulk Excel import/export, Google Calendar sync, white-label multi-tenant portals, production object storage and advanced eKYC are planned or future hardening items unless separately implemented and tested. They must not be described as completed current-release capabilities.</w:t>
       </w:r>
     </w:p>
     <w:sectPr>

</xml_diff>